<commit_message>
docs: renombrar proyecto BOM ERP -> SITRA-ORO en informes, brief y scripts
Rebranding consistente con la migracion de paquete pe.edu.upeu.bomerp ->
pe.edu.upeu.sitraoro: README, entregables ADS/LP2 (S01-S03), scripts BD2 y
BRIEF_DEL_PROYECTO. Solo cambios de nombre/descripcion, sin cambios de contenido
tecnico. BRIEF_DEL_PROYECTO.pdf reexportado (4 paginas, valido).

Co-Authored-By: Claude Sonnet 5 <noreply@anthropic.com>
</commit_message>
<xml_diff>
--- a/docs/BRIEF_DEL_PROYECTO.docx
+++ b/docs/BRIEF_DEL_PROYECTO.docx
@@ -4,14 +4,13 @@
   <w:body>
     <w:p>
       <w:pPr>
-        <w:spacing w:after="80"/>
-        <w:jc w:val="center"/>
+        <w:spacing w:before="0" w:after="40"/>
       </w:pPr>
       <w:r>
         <w:rPr>
           <w:rFonts w:ascii="Arial" w:hAnsi="Arial"/>
           <w:b/>
-          <w:color w:val="1A365D"/>
+          <w:color w:val="002D62"/>
           <w:sz w:val="44"/>
         </w:rPr>
         <w:t>BRIEF DEL PROYECTO</w:t>
@@ -19,23 +18,23 @@
     </w:p>
     <w:p>
       <w:pPr>
-        <w:spacing w:after="320"/>
-        <w:jc w:val="center"/>
+        <w:spacing w:before="0" w:after="240"/>
       </w:pPr>
       <w:r>
         <w:rPr>
           <w:rFonts w:ascii="Arial" w:hAnsi="Arial"/>
           <w:b/>
-          <w:color w:val="DD6B20"/>
-          <w:sz w:val="22"/>
+          <w:color w:val="B45309"/>
+          <w:sz w:val="21"/>
         </w:rPr>
-        <w:t>BOM ERP — SISTEMA DE CONTROL Y ACOPIO DE ORO (bomerp-acopio-oro)</w:t>
+        <w:t>SITRA-ORO — SISTEMA DE INFORMACIÓN, TRAZABILIDAD Y LIQUIDACIÓN EN ACOPIO DE ORO (sitra-oro)</w:t>
       </w:r>
     </w:p>
     <w:tbl>
       <w:tblPr>
         <w:tblW w:type="auto" w:w="0"/>
         <w:jc w:val="center"/>
+        <w:tblLayout w:type="fixed"/>
         <w:tblLook w:firstColumn="1" w:firstRow="1" w:lastColumn="0" w:lastRow="0" w:noHBand="0" w:noVBand="1" w:val="04A0"/>
       </w:tblPr>
       <w:tblGrid>
@@ -45,89 +44,98 @@
         <w:tc>
           <w:tcPr>
             <w:tcW w:type="dxa" w:w="9360"/>
-            <w:shd w:fill="EBF8FF"/>
+            <w:shd w:fill="F0F4F8"/>
             <w:tcMar>
-              <w:top w:w="140" w:type="dxa"/>
-              <w:bottom w:w="140" w:type="dxa"/>
+              <w:top w:w="160" w:type="dxa"/>
+              <w:bottom w:w="160" w:type="dxa"/>
               <w:left w:w="200" w:type="dxa"/>
               <w:right w:w="200" w:type="dxa"/>
             </w:tcMar>
+            <w:tcBorders>
+              <w:top w:val="single" w:sz="4" w:space="0" w:color="CBD5E1"/>
+              <w:bottom w:val="single" w:sz="4" w:space="0" w:color="CBD5E1"/>
+              <w:left w:val="single" w:sz="30" w:space="0" w:color="002D62"/>
+              <w:right w:val="single" w:sz="4" w:space="0" w:color="CBD5E1"/>
+            </w:tcBorders>
           </w:tcPr>
           <w:p>
             <w:pPr>
-              <w:spacing w:after="40"/>
+              <w:spacing w:line="312" w:lineRule="auto" w:after="0"/>
             </w:pPr>
             <w:r>
               <w:rPr>
                 <w:rFonts w:ascii="Arial" w:hAnsi="Arial"/>
                 <w:b/>
-                <w:color w:val="1A365D"/>
+                <w:color w:val="002D62"/>
                 <w:sz w:val="19"/>
               </w:rPr>
-              <w:t xml:space="preserve">Institución: </w:t>
+              <w:t>Institución:</w:t>
             </w:r>
             <w:r>
               <w:rPr>
                 <w:rFonts w:ascii="Arial" w:hAnsi="Arial"/>
-                <w:color w:val="2D3748"/>
+                <w:b w:val="0"/>
+                <w:color w:val="000000"/>
                 <w:sz w:val="19"/>
               </w:rPr>
-              <w:t>Universidad Peruana Unión (UPeU) — Campus Juliaca</w:t>
+              <w:t xml:space="preserve"> Universidad Peruana Unión (UPeU) – Campus Juliaca</w:t>
               <w:br/>
             </w:r>
             <w:r>
               <w:rPr>
                 <w:rFonts w:ascii="Arial" w:hAnsi="Arial"/>
                 <w:b/>
-                <w:color w:val="1A365D"/>
+                <w:color w:val="002D62"/>
                 <w:sz w:val="19"/>
               </w:rPr>
-              <w:t xml:space="preserve">Ciclo y Semestre: </w:t>
+              <w:t>Ciclo y Semestre:</w:t>
             </w:r>
             <w:r>
               <w:rPr>
                 <w:rFonts w:ascii="Arial" w:hAnsi="Arial"/>
-                <w:color w:val="2D3748"/>
+                <w:b w:val="0"/>
+                <w:color w:val="000000"/>
                 <w:sz w:val="19"/>
               </w:rPr>
-              <w:t>Ciclo IV — Semestre Académico 2026-II</w:t>
+              <w:t xml:space="preserve"> Ciclo IV – Semestre Académico 2026-II</w:t>
               <w:br/>
             </w:r>
             <w:r>
               <w:rPr>
                 <w:rFonts w:ascii="Arial" w:hAnsi="Arial"/>
                 <w:b/>
-                <w:color w:val="1A365D"/>
+                <w:color w:val="002D62"/>
                 <w:sz w:val="19"/>
               </w:rPr>
-              <w:t xml:space="preserve">Línea Curricular: </w:t>
+              <w:t>Línea Curricular:</w:t>
             </w:r>
             <w:r>
               <w:rPr>
                 <w:rFonts w:ascii="Arial" w:hAnsi="Arial"/>
-                <w:color w:val="2D3748"/>
+                <w:b w:val="0"/>
+                <w:color w:val="000000"/>
                 <w:sz w:val="19"/>
               </w:rPr>
-              <w:t>ADS (Análisis y Diseño) | BD2 (Base de Datos II) | LP2 (Lenguaje de Programación II)</w:t>
+              <w:t xml:space="preserve"> ADS (Análisis y Diseño) | BD2 (Base de Datos II) | LP2 (Lenguaje de Programación II)</w:t>
               <w:br/>
             </w:r>
             <w:r>
               <w:rPr>
                 <w:rFonts w:ascii="Arial" w:hAnsi="Arial"/>
                 <w:b/>
-                <w:color w:val="1A365D"/>
+                <w:color w:val="002D62"/>
                 <w:sz w:val="19"/>
               </w:rPr>
-              <w:t xml:space="preserve">Equipo de Desarrollo (Equipo 05): </w:t>
+              <w:t>Equipo de Desarrollo (Equipo 05):</w:t>
             </w:r>
             <w:r>
               <w:rPr>
                 <w:rFonts w:ascii="Arial" w:hAnsi="Arial"/>
-                <w:color w:val="2D3748"/>
+                <w:b w:val="0"/>
+                <w:color w:val="000000"/>
                 <w:sz w:val="19"/>
               </w:rPr>
-              <w:t>Faijo Calisaya Helio Paul  &amp;  Figueroa Chambi Jhymel Nelio</w:t>
-              <w:br/>
+              <w:t xml:space="preserve"> Faijo Calisaya Helio Paul  &amp;  Figueroa Chambi Jhymel Nelio</w:t>
             </w:r>
           </w:p>
         </w:tc>
@@ -140,70 +148,109 @@
     </w:p>
     <w:p>
       <w:pPr>
-        <w:pStyle w:val="Heading1"/>
-        <w:spacing w:before="280" w:after="120"/>
+        <w:spacing w:before="240" w:after="120"/>
       </w:pPr>
       <w:r>
         <w:rPr>
           <w:rFonts w:ascii="Arial" w:hAnsi="Arial"/>
           <w:b/>
-          <w:color w:val="2B6CB0"/>
-          <w:sz w:val="28"/>
+          <w:color w:val="003366"/>
+          <w:sz w:val="26"/>
         </w:rPr>
         <w:t>1. Descripción General del Proyecto</w:t>
       </w:r>
     </w:p>
     <w:p>
       <w:pPr>
-        <w:spacing w:after="120" w:line="276" w:lineRule="auto"/>
+        <w:spacing w:after="120"/>
       </w:pPr>
       <w:r>
         <w:rPr>
-          <w:rFonts w:ascii="Arial" w:hAnsi="Arial"/>
-          <w:color w:val="2D3748"/>
-          <w:sz w:val="20"/>
+          <w:b/>
+          <w:color w:val="000000"/>
         </w:rPr>
-        <w:t>BomERP - Acopio de Oro es una solución empresarial full-stack desarrollada para modernizar, estandarizar y digitalizar las operaciones de compra, fundición, pesaje, cotización y liquidación financiera en centros de acopio de oro artesanal.</w:t>
+        <w:t>SITRA-ORO (Sistema de Información, Trazabilidad y Liquidación en Acopio de Oro)</w:t>
+      </w:r>
+      <w:r>
+        <w:rPr>
+          <w:color w:val="000000"/>
+        </w:rPr>
+        <w:t xml:space="preserve"> es una solución empresarial full-stack desarrollada para modernizar, estandarizar y digitalizar las operaciones de compra, fundición, pesaje, cotización y liquidación financiera en centros de acopio de oro artesanal.</w:t>
       </w:r>
     </w:p>
     <w:p>
       <w:pPr>
-        <w:spacing w:after="280" w:line="276" w:lineRule="auto"/>
+        <w:spacing w:after="240"/>
       </w:pPr>
       <w:r>
         <w:rPr>
-          <w:rFonts w:ascii="Arial" w:hAnsi="Arial"/>
-          <w:color w:val="2D3748"/>
-          <w:sz w:val="20"/>
+          <w:color w:val="000000"/>
         </w:rPr>
-        <w:t>El sistema reemplaza los cálculos manuales mediante un flujo transaccional seguro y confiable, garantizando la trazabilidad precisa del mineral desde su pesaje bruto inicial, pasando por la determinación de la merma tras la fundición física y su separación estricta por calidad (Oro Rojo vs. Oro Verde), hasta la liquidación final con compradores mayoristas basada en la cotización internacional de la Onza Troy USD y el tipo de cambio oficial.</w:t>
+        <w:t xml:space="preserve">El sistema reemplaza los cálculos manuales y cuadernos físicos de apuntes mediante un flujo transaccional seguro y confiable, garantizando la </w:t>
+      </w:r>
+      <w:r>
+        <w:rPr>
+          <w:b/>
+          <w:color w:val="000000"/>
+        </w:rPr>
+        <w:t>trazabilidad precisa del mineral</w:t>
+      </w:r>
+      <w:r>
+        <w:rPr>
+          <w:color w:val="000000"/>
+        </w:rPr>
+        <w:t xml:space="preserve"> desde su pesaje bruto inicial, pasando por la determinación de la merma tras la fundición física y su separación estricta por calidad (</w:t>
+      </w:r>
+      <w:r>
+        <w:rPr>
+          <w:b/>
+          <w:color w:val="000000"/>
+        </w:rPr>
+        <w:t>Oro Rojo</w:t>
+      </w:r>
+      <w:r>
+        <w:rPr>
+          <w:color w:val="000000"/>
+        </w:rPr>
+        <w:t xml:space="preserve"> vs. </w:t>
+      </w:r>
+      <w:r>
+        <w:rPr>
+          <w:b/>
+          <w:color w:val="000000"/>
+        </w:rPr>
+        <w:t>Oro Verde</w:t>
+      </w:r>
+      <w:r>
+        <w:rPr>
+          <w:color w:val="000000"/>
+        </w:rPr>
+        <w:t>), hasta la liquidación final con compradores mayoristas basada en la cotización internacional de la Onza Troy USD y el tipo de cambio oficial.</w:t>
       </w:r>
     </w:p>
     <w:p>
       <w:pPr>
-        <w:pStyle w:val="Heading1"/>
-        <w:spacing w:before="280" w:after="160"/>
+        <w:spacing w:before="200" w:after="120"/>
       </w:pPr>
       <w:r>
         <w:rPr>
           <w:rFonts w:ascii="Arial" w:hAnsi="Arial"/>
           <w:b/>
-          <w:color w:val="2B6CB0"/>
-          <w:sz w:val="28"/>
+          <w:color w:val="003366"/>
+          <w:sz w:val="26"/>
         </w:rPr>
         <w:t>2. Especificación Modular del Sistema</w:t>
       </w:r>
     </w:p>
     <w:p>
       <w:pPr>
-        <w:pStyle w:val="Heading2"/>
-        <w:spacing w:before="240" w:after="40"/>
+        <w:spacing w:before="160" w:after="40"/>
       </w:pPr>
       <w:r>
         <w:rPr>
           <w:rFonts w:ascii="Arial" w:hAnsi="Arial"/>
           <w:b/>
-          <w:color w:val="1A365D"/>
+          <w:color w:val="002D62"/>
           <w:sz w:val="23"/>
         </w:rPr>
         <w:t>2.1 Módulo 1: Seguridad y Control de Acceso (seguridad)</w:t>
@@ -211,14 +258,14 @@
     </w:p>
     <w:p>
       <w:pPr>
-        <w:spacing w:after="80"/>
+        <w:spacing w:after="40"/>
       </w:pPr>
       <w:r>
         <w:rPr>
           <w:rFonts w:ascii="Arial" w:hAnsi="Arial"/>
           <w:b/>
-          <w:color w:val="2D3748"/>
-          <w:sz w:val="19"/>
+          <w:color w:val="B45309"/>
+          <w:sz w:val="20"/>
         </w:rPr>
         <w:t xml:space="preserve">Tipo: </w:t>
       </w:r>
@@ -226,30 +273,28 @@
         <w:rPr>
           <w:rFonts w:ascii="Arial" w:hAnsi="Arial"/>
           <w:b/>
-          <w:color w:val="805AD5"/>
-          <w:sz w:val="19"/>
+          <w:color w:val="B45309"/>
+          <w:sz w:val="20"/>
         </w:rPr>
         <w:t>[Transversal / Infraestructura de Acceso]</w:t>
       </w:r>
     </w:p>
     <w:p>
       <w:pPr>
-        <w:spacing w:after="80" w:line="276" w:lineRule="auto"/>
+        <w:spacing w:after="60"/>
       </w:pPr>
       <w:r>
         <w:rPr>
           <w:rFonts w:ascii="Arial" w:hAnsi="Arial"/>
           <w:b/>
-          <w:color w:val="2D3748"/>
-          <w:sz w:val="19"/>
+          <w:color w:val="000000"/>
         </w:rPr>
         <w:t xml:space="preserve">Descripción: </w:t>
       </w:r>
       <w:r>
         <w:rPr>
           <w:rFonts w:ascii="Arial" w:hAnsi="Arial"/>
-          <w:color w:val="2D3748"/>
-          <w:sz w:val="19"/>
+          <w:color w:val="000000"/>
         </w:rPr>
         <w:t>Módulo transversal encargado de garantizar la protección del sistema, autenticación de usuarios, gestión de sesiones sin estado mediante tokens JWT y autorización basada en roles (RBAC).</w:t>
       </w:r>
@@ -262,8 +307,7 @@
         <w:rPr>
           <w:rFonts w:ascii="Arial" w:hAnsi="Arial"/>
           <w:b/>
-          <w:color w:val="2D3748"/>
-          <w:sz w:val="19"/>
+          <w:color w:val="000000"/>
         </w:rPr>
         <w:t>Requerimientos Funcionales:</w:t>
       </w:r>
@@ -271,22 +315,22 @@
     <w:p>
       <w:pPr>
         <w:pStyle w:val="ListBullet"/>
-        <w:spacing w:after="40" w:line="264" w:lineRule="auto"/>
+        <w:spacing w:after="40" w:line="276" w:lineRule="auto"/>
       </w:pPr>
       <w:r>
         <w:rPr>
           <w:rFonts w:ascii="Arial" w:hAnsi="Arial"/>
           <w:b/>
-          <w:color w:val="1A365D"/>
-          <w:sz w:val="18"/>
+          <w:color w:val="000000"/>
+          <w:sz w:val="20"/>
         </w:rPr>
         <w:t xml:space="preserve">RF-SEG-01: </w:t>
       </w:r>
       <w:r>
         <w:rPr>
           <w:rFonts w:ascii="Arial" w:hAnsi="Arial"/>
-          <w:color w:val="2D3748"/>
-          <w:sz w:val="18"/>
+          <w:color w:val="000000"/>
+          <w:sz w:val="20"/>
         </w:rPr>
         <w:t>Registrar usuarios internos con contraseñas encriptadas mediante algoritmo BCrypt.</w:t>
       </w:r>
@@ -294,22 +338,22 @@
     <w:p>
       <w:pPr>
         <w:pStyle w:val="ListBullet"/>
-        <w:spacing w:after="40" w:line="264" w:lineRule="auto"/>
+        <w:spacing w:after="40" w:line="276" w:lineRule="auto"/>
       </w:pPr>
       <w:r>
         <w:rPr>
           <w:rFonts w:ascii="Arial" w:hAnsi="Arial"/>
           <w:b/>
-          <w:color w:val="1A365D"/>
-          <w:sz w:val="18"/>
+          <w:color w:val="000000"/>
+          <w:sz w:val="20"/>
         </w:rPr>
         <w:t xml:space="preserve">RF-SEG-02: </w:t>
       </w:r>
       <w:r>
         <w:rPr>
           <w:rFonts w:ascii="Arial" w:hAnsi="Arial"/>
-          <w:color w:val="2D3748"/>
-          <w:sz w:val="18"/>
+          <w:color w:val="000000"/>
+          <w:sz w:val="20"/>
         </w:rPr>
         <w:t>Autenticar usuarios mediante credenciales seguras (usuario/correo y contraseña).</w:t>
       </w:r>
@@ -317,22 +361,22 @@
     <w:p>
       <w:pPr>
         <w:pStyle w:val="ListBullet"/>
-        <w:spacing w:after="40" w:line="264" w:lineRule="auto"/>
+        <w:spacing w:after="40" w:line="276" w:lineRule="auto"/>
       </w:pPr>
       <w:r>
         <w:rPr>
           <w:rFonts w:ascii="Arial" w:hAnsi="Arial"/>
           <w:b/>
-          <w:color w:val="1A365D"/>
-          <w:sz w:val="18"/>
+          <w:color w:val="000000"/>
+          <w:sz w:val="20"/>
         </w:rPr>
         <w:t xml:space="preserve">RF-SEG-03: </w:t>
       </w:r>
       <w:r>
         <w:rPr>
           <w:rFonts w:ascii="Arial" w:hAnsi="Arial"/>
-          <w:color w:val="2D3748"/>
-          <w:sz w:val="18"/>
+          <w:color w:val="000000"/>
+          <w:sz w:val="20"/>
         </w:rPr>
         <w:t>Emitir y validar tokens JSON Web Tokens (JWT) para autorizar peticiones en el backend.</w:t>
       </w:r>
@@ -340,22 +384,22 @@
     <w:p>
       <w:pPr>
         <w:pStyle w:val="ListBullet"/>
-        <w:spacing w:after="40" w:line="264" w:lineRule="auto"/>
+        <w:spacing w:after="40" w:line="276" w:lineRule="auto"/>
       </w:pPr>
       <w:r>
         <w:rPr>
           <w:rFonts w:ascii="Arial" w:hAnsi="Arial"/>
           <w:b/>
-          <w:color w:val="1A365D"/>
-          <w:sz w:val="18"/>
+          <w:color w:val="000000"/>
+          <w:sz w:val="20"/>
         </w:rPr>
         <w:t xml:space="preserve">RF-SEG-04: </w:t>
       </w:r>
       <w:r>
         <w:rPr>
           <w:rFonts w:ascii="Arial" w:hAnsi="Arial"/>
-          <w:color w:val="2D3748"/>
-          <w:sz w:val="18"/>
+          <w:color w:val="000000"/>
+          <w:sz w:val="20"/>
         </w:rPr>
         <w:t>Restringir el acceso a vistas y endpoints según roles del sistema (ROLE_G2_ACOPIADOR, ROLE_G1_MAYORISTA).</w:t>
       </w:r>
@@ -363,36 +407,35 @@
     <w:p>
       <w:pPr>
         <w:pStyle w:val="ListBullet"/>
-        <w:spacing w:after="40" w:line="264" w:lineRule="auto"/>
+        <w:spacing w:after="40" w:line="276" w:lineRule="auto"/>
       </w:pPr>
       <w:r>
         <w:rPr>
           <w:rFonts w:ascii="Arial" w:hAnsi="Arial"/>
           <w:b/>
-          <w:color w:val="1A365D"/>
-          <w:sz w:val="18"/>
+          <w:color w:val="000000"/>
+          <w:sz w:val="20"/>
         </w:rPr>
         <w:t xml:space="preserve">RF-SEG-05: </w:t>
       </w:r>
       <w:r>
         <w:rPr>
           <w:rFonts w:ascii="Arial" w:hAnsi="Arial"/>
-          <w:color w:val="2D3748"/>
-          <w:sz w:val="18"/>
+          <w:color w:val="000000"/>
+          <w:sz w:val="20"/>
         </w:rPr>
         <w:t>Proveer mecanismo de cierre de sesión e invalidación de contexto seguro.</w:t>
       </w:r>
     </w:p>
     <w:p>
       <w:pPr>
-        <w:spacing w:before="60" w:after="160"/>
+        <w:spacing w:before="40" w:after="160"/>
       </w:pPr>
       <w:r>
         <w:rPr>
           <w:rFonts w:ascii="Arial" w:hAnsi="Arial"/>
           <w:b/>
-          <w:color w:val="2D3748"/>
-          <w:sz w:val="19"/>
+          <w:color w:val="000000"/>
         </w:rPr>
         <w:t xml:space="preserve">Programador Responsable: </w:t>
       </w:r>
@@ -400,22 +443,20 @@
         <w:rPr>
           <w:rFonts w:ascii="Arial" w:hAnsi="Arial"/>
           <w:b/>
-          <w:color w:val="2B6CB0"/>
-          <w:sz w:val="19"/>
+          <w:color w:val="003366"/>
         </w:rPr>
         <w:t>Faijo Calisaya Helio Paul  &amp;  Figueroa Chambi Jhymel Nelio (Desarrollo colaborativo)</w:t>
       </w:r>
     </w:p>
     <w:p>
       <w:pPr>
-        <w:pStyle w:val="Heading2"/>
-        <w:spacing w:before="240" w:after="40"/>
+        <w:spacing w:before="160" w:after="40"/>
       </w:pPr>
       <w:r>
         <w:rPr>
           <w:rFonts w:ascii="Arial" w:hAnsi="Arial"/>
           <w:b/>
-          <w:color w:val="1A365D"/>
+          <w:color w:val="002D62"/>
           <w:sz w:val="23"/>
         </w:rPr>
         <w:t>2.2 Módulo 2: Compras y Acopio Presencial (acopiador)</w:t>
@@ -423,14 +464,14 @@
     </w:p>
     <w:p>
       <w:pPr>
-        <w:spacing w:after="80"/>
+        <w:spacing w:after="40"/>
       </w:pPr>
       <w:r>
         <w:rPr>
           <w:rFonts w:ascii="Arial" w:hAnsi="Arial"/>
           <w:b/>
-          <w:color w:val="2D3748"/>
-          <w:sz w:val="19"/>
+          <w:color w:val="B45309"/>
+          <w:sz w:val="20"/>
         </w:rPr>
         <w:t xml:space="preserve">Tipo: </w:t>
       </w:r>
@@ -438,30 +479,28 @@
         <w:rPr>
           <w:rFonts w:ascii="Arial" w:hAnsi="Arial"/>
           <w:b/>
-          <w:color w:val="DD6B20"/>
-          <w:sz w:val="19"/>
+          <w:color w:val="B45309"/>
+          <w:sz w:val="20"/>
         </w:rPr>
         <w:t>[Transaccional 1 (G2 Compras)]</w:t>
       </w:r>
     </w:p>
     <w:p>
       <w:pPr>
-        <w:spacing w:after="80" w:line="276" w:lineRule="auto"/>
+        <w:spacing w:after="60"/>
       </w:pPr>
       <w:r>
         <w:rPr>
           <w:rFonts w:ascii="Arial" w:hAnsi="Arial"/>
           <w:b/>
-          <w:color w:val="2D3748"/>
-          <w:sz w:val="19"/>
+          <w:color w:val="000000"/>
         </w:rPr>
         <w:t xml:space="preserve">Descripción: </w:t>
       </w:r>
       <w:r>
         <w:rPr>
           <w:rFonts w:ascii="Arial" w:hAnsi="Arial"/>
-          <w:color w:val="2D3748"/>
-          <w:sz w:val="19"/>
+          <w:color w:val="000000"/>
         </w:rPr>
         <w:t>Módulo transaccional principal para el puesto de acopio presencial (G2). Gestiona la recepción física del oro entregado por mineros, el pesaje bruto, la fundición real con cálculo de merma, la clasificación por calidad y la emisión del comprobante de pago en efectivo.</w:t>
       </w:r>
@@ -474,8 +513,7 @@
         <w:rPr>
           <w:rFonts w:ascii="Arial" w:hAnsi="Arial"/>
           <w:b/>
-          <w:color w:val="2D3748"/>
-          <w:sz w:val="19"/>
+          <w:color w:val="000000"/>
         </w:rPr>
         <w:t>Requerimientos Funcionales:</w:t>
       </w:r>
@@ -483,22 +521,22 @@
     <w:p>
       <w:pPr>
         <w:pStyle w:val="ListBullet"/>
-        <w:spacing w:after="40" w:line="264" w:lineRule="auto"/>
+        <w:spacing w:after="40" w:line="276" w:lineRule="auto"/>
       </w:pPr>
       <w:r>
         <w:rPr>
           <w:rFonts w:ascii="Arial" w:hAnsi="Arial"/>
           <w:b/>
-          <w:color w:val="1A365D"/>
-          <w:sz w:val="18"/>
+          <w:color w:val="000000"/>
+          <w:sz w:val="20"/>
         </w:rPr>
         <w:t xml:space="preserve">RF-ACO-01: </w:t>
       </w:r>
       <w:r>
         <w:rPr>
           <w:rFonts w:ascii="Arial" w:hAnsi="Arial"/>
-          <w:color w:val="2D3748"/>
-          <w:sz w:val="18"/>
+          <w:color w:val="000000"/>
+          <w:sz w:val="20"/>
         </w:rPr>
         <w:t>Registrar una nueva transacción de compra presencial vinculando al minero artesanal.</w:t>
       </w:r>
@@ -506,22 +544,22 @@
     <w:p>
       <w:pPr>
         <w:pStyle w:val="ListBullet"/>
-        <w:spacing w:after="40" w:line="264" w:lineRule="auto"/>
+        <w:spacing w:after="40" w:line="276" w:lineRule="auto"/>
       </w:pPr>
       <w:r>
         <w:rPr>
           <w:rFonts w:ascii="Arial" w:hAnsi="Arial"/>
           <w:b/>
-          <w:color w:val="1A365D"/>
-          <w:sz w:val="18"/>
+          <w:color w:val="000000"/>
+          <w:sz w:val="20"/>
         </w:rPr>
         <w:t xml:space="preserve">RF-ACO-02: </w:t>
       </w:r>
       <w:r>
         <w:rPr>
           <w:rFonts w:ascii="Arial" w:hAnsi="Arial"/>
-          <w:color w:val="2D3748"/>
-          <w:sz w:val="18"/>
+          <w:color w:val="000000"/>
+          <w:sz w:val="20"/>
         </w:rPr>
         <w:t>Capturar el peso bruto inicial (sin fundir) y el peso neto tras la fundición física.</w:t>
       </w:r>
@@ -529,22 +567,22 @@
     <w:p>
       <w:pPr>
         <w:pStyle w:val="ListBullet"/>
-        <w:spacing w:after="40" w:line="264" w:lineRule="auto"/>
+        <w:spacing w:after="40" w:line="276" w:lineRule="auto"/>
       </w:pPr>
       <w:r>
         <w:rPr>
           <w:rFonts w:ascii="Arial" w:hAnsi="Arial"/>
           <w:b/>
-          <w:color w:val="1A365D"/>
-          <w:sz w:val="18"/>
+          <w:color w:val="000000"/>
+          <w:sz w:val="20"/>
         </w:rPr>
         <w:t xml:space="preserve">RF-ACO-03: </w:t>
       </w:r>
       <w:r>
         <w:rPr>
           <w:rFonts w:ascii="Arial" w:hAnsi="Arial"/>
-          <w:color w:val="2D3748"/>
-          <w:sz w:val="18"/>
+          <w:color w:val="000000"/>
+          <w:sz w:val="20"/>
         </w:rPr>
         <w:t>Calcular de forma automática la bajada o merma resultante del proceso de fundición.</w:t>
       </w:r>
@@ -552,22 +590,22 @@
     <w:p>
       <w:pPr>
         <w:pStyle w:val="ListBullet"/>
-        <w:spacing w:after="40" w:line="264" w:lineRule="auto"/>
+        <w:spacing w:after="40" w:line="276" w:lineRule="auto"/>
       </w:pPr>
       <w:r>
         <w:rPr>
           <w:rFonts w:ascii="Arial" w:hAnsi="Arial"/>
           <w:b/>
-          <w:color w:val="1A365D"/>
-          <w:sz w:val="18"/>
+          <w:color w:val="000000"/>
+          <w:sz w:val="20"/>
         </w:rPr>
         <w:t xml:space="preserve">RF-ACO-04: </w:t>
       </w:r>
       <w:r>
         <w:rPr>
           <w:rFonts w:ascii="Arial" w:hAnsi="Arial"/>
-          <w:color w:val="2D3748"/>
-          <w:sz w:val="18"/>
+          <w:color w:val="000000"/>
+          <w:sz w:val="20"/>
         </w:rPr>
         <w:t>Clasificar obligatoriamente el lote fundido en Oro Rojo o Oro Verde.</w:t>
       </w:r>
@@ -575,22 +613,22 @@
     <w:p>
       <w:pPr>
         <w:pStyle w:val="ListBullet"/>
-        <w:spacing w:after="40" w:line="264" w:lineRule="auto"/>
+        <w:spacing w:after="40" w:line="276" w:lineRule="auto"/>
       </w:pPr>
       <w:r>
         <w:rPr>
           <w:rFonts w:ascii="Arial" w:hAnsi="Arial"/>
           <w:b/>
-          <w:color w:val="1A365D"/>
-          <w:sz w:val="18"/>
+          <w:color w:val="000000"/>
+          <w:sz w:val="20"/>
         </w:rPr>
         <w:t xml:space="preserve">RF-ACO-05: </w:t>
       </w:r>
       <w:r>
         <w:rPr>
           <w:rFonts w:ascii="Arial" w:hAnsi="Arial"/>
-          <w:color w:val="2D3748"/>
-          <w:sz w:val="18"/>
+          <w:color w:val="000000"/>
+          <w:sz w:val="20"/>
         </w:rPr>
         <w:t>Calcular el importe total a liquidar en Soles (PEN) multiplicando gramos fundidos por el precio vigente del día.</w:t>
       </w:r>
@@ -598,22 +636,22 @@
     <w:p>
       <w:pPr>
         <w:pStyle w:val="ListBullet"/>
-        <w:spacing w:after="40" w:line="264" w:lineRule="auto"/>
+        <w:spacing w:after="40" w:line="276" w:lineRule="auto"/>
       </w:pPr>
       <w:r>
         <w:rPr>
           <w:rFonts w:ascii="Arial" w:hAnsi="Arial"/>
           <w:b/>
-          <w:color w:val="1A365D"/>
-          <w:sz w:val="18"/>
+          <w:color w:val="000000"/>
+          <w:sz w:val="20"/>
         </w:rPr>
         <w:t xml:space="preserve">RF-ACO-06: </w:t>
       </w:r>
       <w:r>
         <w:rPr>
           <w:rFonts w:ascii="Arial" w:hAnsi="Arial"/>
-          <w:color w:val="2D3748"/>
-          <w:sz w:val="18"/>
+          <w:color w:val="000000"/>
+          <w:sz w:val="20"/>
         </w:rPr>
         <w:t>Consolidar en tiempo real los acumulados del día/semana manteniendo estrictamente separados los totales de Oro Rojo y Oro Verde.</w:t>
       </w:r>
@@ -621,36 +659,35 @@
     <w:p>
       <w:pPr>
         <w:pStyle w:val="ListBullet"/>
-        <w:spacing w:after="40" w:line="264" w:lineRule="auto"/>
+        <w:spacing w:after="40" w:line="276" w:lineRule="auto"/>
       </w:pPr>
       <w:r>
         <w:rPr>
           <w:rFonts w:ascii="Arial" w:hAnsi="Arial"/>
           <w:b/>
-          <w:color w:val="1A365D"/>
-          <w:sz w:val="18"/>
+          <w:color w:val="000000"/>
+          <w:sz w:val="20"/>
         </w:rPr>
         <w:t xml:space="preserve">RF-ACO-07: </w:t>
       </w:r>
       <w:r>
         <w:rPr>
           <w:rFonts w:ascii="Arial" w:hAnsi="Arial"/>
-          <w:color w:val="2D3748"/>
-          <w:sz w:val="18"/>
+          <w:color w:val="000000"/>
+          <w:sz w:val="20"/>
         </w:rPr>
         <w:t>Permitir la anulación controlada de una compra con reversión automática de saldos acumulados para auditoría.</w:t>
       </w:r>
     </w:p>
     <w:p>
       <w:pPr>
-        <w:spacing w:before="60" w:after="160"/>
+        <w:spacing w:before="40" w:after="160"/>
       </w:pPr>
       <w:r>
         <w:rPr>
           <w:rFonts w:ascii="Arial" w:hAnsi="Arial"/>
           <w:b/>
-          <w:color w:val="2D3748"/>
-          <w:sz w:val="19"/>
+          <w:color w:val="000000"/>
         </w:rPr>
         <w:t xml:space="preserve">Programador Responsable: </w:t>
       </w:r>
@@ -658,22 +695,20 @@
         <w:rPr>
           <w:rFonts w:ascii="Arial" w:hAnsi="Arial"/>
           <w:b/>
-          <w:color w:val="2B6CB0"/>
-          <w:sz w:val="19"/>
+          <w:color w:val="003366"/>
         </w:rPr>
         <w:t>Faijo Calisaya Helio Paul</w:t>
       </w:r>
     </w:p>
     <w:p>
       <w:pPr>
-        <w:pStyle w:val="Heading2"/>
-        <w:spacing w:before="240" w:after="40"/>
+        <w:spacing w:before="160" w:after="40"/>
       </w:pPr>
       <w:r>
         <w:rPr>
           <w:rFonts w:ascii="Arial" w:hAnsi="Arial"/>
           <w:b/>
-          <w:color w:val="1A365D"/>
+          <w:color w:val="002D62"/>
           <w:sz w:val="23"/>
         </w:rPr>
         <w:t>2.3 Módulo 3: Liquidaciones y Cierres Mayoristas (mayorista)</w:t>
@@ -681,14 +716,14 @@
     </w:p>
     <w:p>
       <w:pPr>
-        <w:spacing w:after="80"/>
+        <w:spacing w:after="40"/>
       </w:pPr>
       <w:r>
         <w:rPr>
           <w:rFonts w:ascii="Arial" w:hAnsi="Arial"/>
           <w:b/>
-          <w:color w:val="2D3748"/>
-          <w:sz w:val="19"/>
+          <w:color w:val="B45309"/>
+          <w:sz w:val="20"/>
         </w:rPr>
         <w:t xml:space="preserve">Tipo: </w:t>
       </w:r>
@@ -696,30 +731,28 @@
         <w:rPr>
           <w:rFonts w:ascii="Arial" w:hAnsi="Arial"/>
           <w:b/>
-          <w:color w:val="DD6B20"/>
-          <w:sz w:val="19"/>
+          <w:color w:val="B45309"/>
+          <w:sz w:val="20"/>
         </w:rPr>
         <w:t>[Transaccional 2 (G1 Cierres)]</w:t>
       </w:r>
     </w:p>
     <w:p>
       <w:pPr>
-        <w:spacing w:after="80" w:line="276" w:lineRule="auto"/>
+        <w:spacing w:after="60"/>
       </w:pPr>
       <w:r>
         <w:rPr>
           <w:rFonts w:ascii="Arial" w:hAnsi="Arial"/>
           <w:b/>
-          <w:color w:val="2D3748"/>
-          <w:sz w:val="19"/>
+          <w:color w:val="000000"/>
         </w:rPr>
         <w:t xml:space="preserve">Descripción: </w:t>
       </w:r>
       <w:r>
         <w:rPr>
           <w:rFonts w:ascii="Arial" w:hAnsi="Arial"/>
-          <w:color w:val="2D3748"/>
-          <w:sz w:val="19"/>
+          <w:color w:val="000000"/>
         </w:rPr>
         <w:t>Módulo transaccional de consolidación para el comprador mayorista (G1). Procesa el cierre y compra del lote semanal acumulado por el acopiador (G2), aplicando la Cotización internacional de la Onza Troy en USD y el Tipo de Cambio oficial a Soles.</w:t>
       </w:r>
@@ -732,8 +765,7 @@
         <w:rPr>
           <w:rFonts w:ascii="Arial" w:hAnsi="Arial"/>
           <w:b/>
-          <w:color w:val="2D3748"/>
-          <w:sz w:val="19"/>
+          <w:color w:val="000000"/>
         </w:rPr>
         <w:t>Requerimientos Funcionales:</w:t>
       </w:r>
@@ -741,22 +773,22 @@
     <w:p>
       <w:pPr>
         <w:pStyle w:val="ListBullet"/>
-        <w:spacing w:after="40" w:line="264" w:lineRule="auto"/>
+        <w:spacing w:after="40" w:line="276" w:lineRule="auto"/>
       </w:pPr>
       <w:r>
         <w:rPr>
           <w:rFonts w:ascii="Arial" w:hAnsi="Arial"/>
           <w:b/>
-          <w:color w:val="1A365D"/>
-          <w:sz w:val="18"/>
+          <w:color w:val="000000"/>
+          <w:sz w:val="20"/>
         </w:rPr>
         <w:t xml:space="preserve">RF-MAY-01: </w:t>
       </w:r>
       <w:r>
         <w:rPr>
           <w:rFonts w:ascii="Arial" w:hAnsi="Arial"/>
-          <w:color w:val="2D3748"/>
-          <w:sz w:val="18"/>
+          <w:color w:val="000000"/>
+          <w:sz w:val="20"/>
         </w:rPr>
         <w:t>Consolidar el lote total de gramos acumulados por el acopiador G2 al término del periodo semanal.</w:t>
       </w:r>
@@ -764,22 +796,22 @@
     <w:p>
       <w:pPr>
         <w:pStyle w:val="ListBullet"/>
-        <w:spacing w:after="40" w:line="264" w:lineRule="auto"/>
+        <w:spacing w:after="40" w:line="276" w:lineRule="auto"/>
       </w:pPr>
       <w:r>
         <w:rPr>
           <w:rFonts w:ascii="Arial" w:hAnsi="Arial"/>
           <w:b/>
-          <w:color w:val="1A365D"/>
-          <w:sz w:val="18"/>
+          <w:color w:val="000000"/>
+          <w:sz w:val="20"/>
         </w:rPr>
         <w:t xml:space="preserve">RF-MAY-02: </w:t>
       </w:r>
       <w:r>
         <w:rPr>
           <w:rFonts w:ascii="Arial" w:hAnsi="Arial"/>
-          <w:color w:val="2D3748"/>
-          <w:sz w:val="18"/>
+          <w:color w:val="000000"/>
+          <w:sz w:val="20"/>
         </w:rPr>
         <w:t>Registrar los parámetros del mercado internacional: valor de la Onza Troy USD y Tipo de Cambio oficial (USD a PEN).</w:t>
       </w:r>
@@ -787,22 +819,22 @@
     <w:p>
       <w:pPr>
         <w:pStyle w:val="ListBullet"/>
-        <w:spacing w:after="40" w:line="264" w:lineRule="auto"/>
+        <w:spacing w:after="40" w:line="276" w:lineRule="auto"/>
       </w:pPr>
       <w:r>
         <w:rPr>
           <w:rFonts w:ascii="Arial" w:hAnsi="Arial"/>
           <w:b/>
-          <w:color w:val="1A365D"/>
-          <w:sz w:val="18"/>
+          <w:color w:val="000000"/>
+          <w:sz w:val="20"/>
         </w:rPr>
         <w:t xml:space="preserve">RF-MAY-03: </w:t>
       </w:r>
       <w:r>
         <w:rPr>
           <w:rFonts w:ascii="Arial" w:hAnsi="Arial"/>
-          <w:color w:val="2D3748"/>
-          <w:sz w:val="18"/>
+          <w:color w:val="000000"/>
+          <w:sz w:val="20"/>
         </w:rPr>
         <w:t>Determinar el precio resultante por gramo en Soles diferenciado según el tipo de oro (Rojo o Verde).</w:t>
       </w:r>
@@ -810,22 +842,22 @@
     <w:p>
       <w:pPr>
         <w:pStyle w:val="ListBullet"/>
-        <w:spacing w:after="40" w:line="264" w:lineRule="auto"/>
+        <w:spacing w:after="40" w:line="276" w:lineRule="auto"/>
       </w:pPr>
       <w:r>
         <w:rPr>
           <w:rFonts w:ascii="Arial" w:hAnsi="Arial"/>
           <w:b/>
-          <w:color w:val="1A365D"/>
-          <w:sz w:val="18"/>
+          <w:color w:val="000000"/>
+          <w:sz w:val="20"/>
         </w:rPr>
         <w:t xml:space="preserve">RF-MAY-04: </w:t>
       </w:r>
       <w:r>
         <w:rPr>
           <w:rFonts w:ascii="Arial" w:hAnsi="Arial"/>
-          <w:color w:val="2D3748"/>
-          <w:sz w:val="18"/>
+          <w:color w:val="000000"/>
+          <w:sz w:val="20"/>
         </w:rPr>
         <w:t>Liquidar la transacción semanal emitiendo comprobante y marcando lotes como cerrados/transferidos.</w:t>
       </w:r>
@@ -833,22 +865,22 @@
     <w:p>
       <w:pPr>
         <w:pStyle w:val="ListBullet"/>
-        <w:spacing w:after="40" w:line="264" w:lineRule="auto"/>
+        <w:spacing w:after="40" w:line="276" w:lineRule="auto"/>
       </w:pPr>
       <w:r>
         <w:rPr>
           <w:rFonts w:ascii="Arial" w:hAnsi="Arial"/>
           <w:b/>
-          <w:color w:val="1A365D"/>
-          <w:sz w:val="18"/>
+          <w:color w:val="000000"/>
+          <w:sz w:val="20"/>
         </w:rPr>
         <w:t xml:space="preserve">RF-MAY-05: </w:t>
       </w:r>
       <w:r>
         <w:rPr>
           <w:rFonts w:ascii="Arial" w:hAnsi="Arial"/>
-          <w:color w:val="2D3748"/>
-          <w:sz w:val="18"/>
+          <w:color w:val="000000"/>
+          <w:sz w:val="20"/>
         </w:rPr>
         <w:t>Registrar el desembolso financiero total realizado por G1 hacia el acopiador G2.</w:t>
       </w:r>
@@ -856,36 +888,35 @@
     <w:p>
       <w:pPr>
         <w:pStyle w:val="ListBullet"/>
-        <w:spacing w:after="40" w:line="264" w:lineRule="auto"/>
+        <w:spacing w:after="40" w:line="276" w:lineRule="auto"/>
       </w:pPr>
       <w:r>
         <w:rPr>
           <w:rFonts w:ascii="Arial" w:hAnsi="Arial"/>
           <w:b/>
-          <w:color w:val="1A365D"/>
-          <w:sz w:val="18"/>
+          <w:color w:val="000000"/>
+          <w:sz w:val="20"/>
         </w:rPr>
         <w:t xml:space="preserve">RF-MAY-06: </w:t>
       </w:r>
       <w:r>
         <w:rPr>
           <w:rFonts w:ascii="Arial" w:hAnsi="Arial"/>
-          <w:color w:val="2D3748"/>
-          <w:sz w:val="18"/>
+          <w:color w:val="000000"/>
+          <w:sz w:val="20"/>
         </w:rPr>
         <w:t>Consultar el histórico detallado de cierres semanales y comprobantes de liquidación.</w:t>
       </w:r>
     </w:p>
     <w:p>
       <w:pPr>
-        <w:spacing w:before="60" w:after="160"/>
+        <w:spacing w:before="40" w:after="160"/>
       </w:pPr>
       <w:r>
         <w:rPr>
           <w:rFonts w:ascii="Arial" w:hAnsi="Arial"/>
           <w:b/>
-          <w:color w:val="2D3748"/>
-          <w:sz w:val="19"/>
+          <w:color w:val="000000"/>
         </w:rPr>
         <w:t xml:space="preserve">Programador Responsable: </w:t>
       </w:r>
@@ -893,22 +924,20 @@
         <w:rPr>
           <w:rFonts w:ascii="Arial" w:hAnsi="Arial"/>
           <w:b/>
-          <w:color w:val="2B6CB0"/>
-          <w:sz w:val="19"/>
+          <w:color w:val="003366"/>
         </w:rPr>
         <w:t>Figueroa Chambi Jhymel Nelio</w:t>
       </w:r>
     </w:p>
     <w:p>
       <w:pPr>
-        <w:pStyle w:val="Heading2"/>
-        <w:spacing w:before="240" w:after="40"/>
+        <w:spacing w:before="160" w:after="40"/>
       </w:pPr>
       <w:r>
         <w:rPr>
           <w:rFonts w:ascii="Arial" w:hAnsi="Arial"/>
           <w:b/>
-          <w:color w:val="1A365D"/>
+          <w:color w:val="002D62"/>
           <w:sz w:val="23"/>
         </w:rPr>
         <w:t>2.4 Módulo 4: Cotizador y Simulación Pública (cotizador)</w:t>
@@ -916,14 +945,14 @@
     </w:p>
     <w:p>
       <w:pPr>
-        <w:spacing w:after="80"/>
+        <w:spacing w:after="40"/>
       </w:pPr>
       <w:r>
         <w:rPr>
           <w:rFonts w:ascii="Arial" w:hAnsi="Arial"/>
           <w:b/>
-          <w:color w:val="2D3748"/>
-          <w:sz w:val="19"/>
+          <w:color w:val="B45309"/>
+          <w:sz w:val="20"/>
         </w:rPr>
         <w:t xml:space="preserve">Tipo: </w:t>
       </w:r>
@@ -931,30 +960,28 @@
         <w:rPr>
           <w:rFonts w:ascii="Arial" w:hAnsi="Arial"/>
           <w:b/>
-          <w:color w:val="319795"/>
-          <w:sz w:val="19"/>
+          <w:color w:val="B45309"/>
+          <w:sz w:val="20"/>
         </w:rPr>
         <w:t>[No Transaccional 1 (Simulador Minero)]</w:t>
       </w:r>
     </w:p>
     <w:p>
       <w:pPr>
-        <w:spacing w:after="80" w:line="276" w:lineRule="auto"/>
+        <w:spacing w:after="60"/>
       </w:pPr>
       <w:r>
         <w:rPr>
           <w:rFonts w:ascii="Arial" w:hAnsi="Arial"/>
           <w:b/>
-          <w:color w:val="2D3748"/>
-          <w:sz w:val="19"/>
+          <w:color w:val="000000"/>
         </w:rPr>
         <w:t xml:space="preserve">Descripción: </w:t>
       </w:r>
       <w:r>
         <w:rPr>
           <w:rFonts w:ascii="Arial" w:hAnsi="Arial"/>
-          <w:color w:val="2D3748"/>
-          <w:sz w:val="19"/>
+          <w:color w:val="000000"/>
         </w:rPr>
         <w:t>Módulo informativo y consultivo de acceso público abierto en la web/móvil para los mineros artesanales. Permite simular el valor económico aproximado de su mineral antes de viajar al centro de acopio físico, sin necesidad de iniciar sesión.</w:t>
       </w:r>
@@ -967,8 +994,7 @@
         <w:rPr>
           <w:rFonts w:ascii="Arial" w:hAnsi="Arial"/>
           <w:b/>
-          <w:color w:val="2D3748"/>
-          <w:sz w:val="19"/>
+          <w:color w:val="000000"/>
         </w:rPr>
         <w:t>Requerimientos Funcionales:</w:t>
       </w:r>
@@ -976,22 +1002,22 @@
     <w:p>
       <w:pPr>
         <w:pStyle w:val="ListBullet"/>
-        <w:spacing w:after="40" w:line="264" w:lineRule="auto"/>
+        <w:spacing w:after="40" w:line="276" w:lineRule="auto"/>
       </w:pPr>
       <w:r>
         <w:rPr>
           <w:rFonts w:ascii="Arial" w:hAnsi="Arial"/>
           <w:b/>
-          <w:color w:val="1A365D"/>
-          <w:sz w:val="18"/>
+          <w:color w:val="000000"/>
+          <w:sz w:val="20"/>
         </w:rPr>
         <w:t xml:space="preserve">RF-COT-01: </w:t>
       </w:r>
       <w:r>
         <w:rPr>
           <w:rFonts w:ascii="Arial" w:hAnsi="Arial"/>
-          <w:color w:val="2D3748"/>
-          <w:sz w:val="18"/>
+          <w:color w:val="000000"/>
+          <w:sz w:val="20"/>
         </w:rPr>
         <w:t>Permitir al minero ingresar la cantidad de gramos de oro bruto estimado a consultar.</w:t>
       </w:r>
@@ -999,22 +1025,22 @@
     <w:p>
       <w:pPr>
         <w:pStyle w:val="ListBullet"/>
-        <w:spacing w:after="40" w:line="264" w:lineRule="auto"/>
+        <w:spacing w:after="40" w:line="276" w:lineRule="auto"/>
       </w:pPr>
       <w:r>
         <w:rPr>
           <w:rFonts w:ascii="Arial" w:hAnsi="Arial"/>
           <w:b/>
-          <w:color w:val="1A365D"/>
-          <w:sz w:val="18"/>
+          <w:color w:val="000000"/>
+          <w:sz w:val="20"/>
         </w:rPr>
         <w:t xml:space="preserve">RF-COT-02: </w:t>
       </w:r>
       <w:r>
         <w:rPr>
           <w:rFonts w:ascii="Arial" w:hAnsi="Arial"/>
-          <w:color w:val="2D3748"/>
-          <w:sz w:val="18"/>
+          <w:color w:val="000000"/>
+          <w:sz w:val="20"/>
         </w:rPr>
         <w:t>Calcular una merma/bajada proyectada basada en promedios referenciales de fundición.</w:t>
       </w:r>
@@ -1022,22 +1048,22 @@
     <w:p>
       <w:pPr>
         <w:pStyle w:val="ListBullet"/>
-        <w:spacing w:after="40" w:line="264" w:lineRule="auto"/>
+        <w:spacing w:after="40" w:line="276" w:lineRule="auto"/>
       </w:pPr>
       <w:r>
         <w:rPr>
           <w:rFonts w:ascii="Arial" w:hAnsi="Arial"/>
           <w:b/>
-          <w:color w:val="1A365D"/>
-          <w:sz w:val="18"/>
+          <w:color w:val="000000"/>
+          <w:sz w:val="20"/>
         </w:rPr>
         <w:t xml:space="preserve">RF-COT-03: </w:t>
       </w:r>
       <w:r>
         <w:rPr>
           <w:rFonts w:ascii="Arial" w:hAnsi="Arial"/>
-          <w:color w:val="2D3748"/>
-          <w:sz w:val="18"/>
+          <w:color w:val="000000"/>
+          <w:sz w:val="20"/>
         </w:rPr>
         <w:t>Calcular y mostrar en pantalla el importe estimado en Soles (PEN) que recibiría según la tarifa oficial del día.</w:t>
       </w:r>
@@ -1045,22 +1071,22 @@
     <w:p>
       <w:pPr>
         <w:pStyle w:val="ListBullet"/>
-        <w:spacing w:after="40" w:line="264" w:lineRule="auto"/>
+        <w:spacing w:after="40" w:line="276" w:lineRule="auto"/>
       </w:pPr>
       <w:r>
         <w:rPr>
           <w:rFonts w:ascii="Arial" w:hAnsi="Arial"/>
           <w:b/>
-          <w:color w:val="1A365D"/>
-          <w:sz w:val="18"/>
+          <w:color w:val="000000"/>
+          <w:sz w:val="20"/>
         </w:rPr>
         <w:t xml:space="preserve">RF-COT-04: </w:t>
       </w:r>
       <w:r>
         <w:rPr>
           <w:rFonts w:ascii="Arial" w:hAnsi="Arial"/>
-          <w:color w:val="2D3748"/>
-          <w:sz w:val="18"/>
+          <w:color w:val="000000"/>
+          <w:sz w:val="20"/>
         </w:rPr>
         <w:t>Mostrar una tabla referencial con rangos de peso y valores estimados para orientación del minero.</w:t>
       </w:r>
@@ -1068,36 +1094,35 @@
     <w:p>
       <w:pPr>
         <w:pStyle w:val="ListBullet"/>
-        <w:spacing w:after="40" w:line="264" w:lineRule="auto"/>
+        <w:spacing w:after="40" w:line="276" w:lineRule="auto"/>
       </w:pPr>
       <w:r>
         <w:rPr>
           <w:rFonts w:ascii="Arial" w:hAnsi="Arial"/>
           <w:b/>
-          <w:color w:val="1A365D"/>
-          <w:sz w:val="18"/>
+          <w:color w:val="000000"/>
+          <w:sz w:val="20"/>
         </w:rPr>
         <w:t xml:space="preserve">RF-COT-05: </w:t>
       </w:r>
       <w:r>
         <w:rPr>
           <w:rFonts w:ascii="Arial" w:hAnsi="Arial"/>
-          <w:color w:val="2D3748"/>
-          <w:sz w:val="18"/>
+          <w:color w:val="000000"/>
+          <w:sz w:val="20"/>
         </w:rPr>
         <w:t>Garantizar que la consulta sea volátil (en memoria), sin persistir transacciones en base de datos ni requerir login.</w:t>
       </w:r>
     </w:p>
     <w:p>
       <w:pPr>
-        <w:spacing w:before="60" w:after="160"/>
+        <w:spacing w:before="40" w:after="160"/>
       </w:pPr>
       <w:r>
         <w:rPr>
           <w:rFonts w:ascii="Arial" w:hAnsi="Arial"/>
           <w:b/>
-          <w:color w:val="2D3748"/>
-          <w:sz w:val="19"/>
+          <w:color w:val="000000"/>
         </w:rPr>
         <w:t xml:space="preserve">Programador Responsable: </w:t>
       </w:r>
@@ -1105,22 +1130,20 @@
         <w:rPr>
           <w:rFonts w:ascii="Arial" w:hAnsi="Arial"/>
           <w:b/>
-          <w:color w:val="2B6CB0"/>
-          <w:sz w:val="19"/>
+          <w:color w:val="003366"/>
         </w:rPr>
         <w:t>Faijo Calisaya Helio Paul</w:t>
       </w:r>
     </w:p>
     <w:p>
       <w:pPr>
-        <w:pStyle w:val="Heading2"/>
-        <w:spacing w:before="240" w:after="40"/>
+        <w:spacing w:before="160" w:after="40"/>
       </w:pPr>
       <w:r>
         <w:rPr>
           <w:rFonts w:ascii="Arial" w:hAnsi="Arial"/>
           <w:b/>
-          <w:color w:val="1A365D"/>
+          <w:color w:val="002D62"/>
           <w:sz w:val="23"/>
         </w:rPr>
         <w:t>2.5 Módulo 5: Parámetros Maestros y Dashboard (parametros)</w:t>
@@ -1128,14 +1151,14 @@
     </w:p>
     <w:p>
       <w:pPr>
-        <w:spacing w:after="80"/>
+        <w:spacing w:after="40"/>
       </w:pPr>
       <w:r>
         <w:rPr>
           <w:rFonts w:ascii="Arial" w:hAnsi="Arial"/>
           <w:b/>
-          <w:color w:val="2D3748"/>
-          <w:sz w:val="19"/>
+          <w:color w:val="B45309"/>
+          <w:sz w:val="20"/>
         </w:rPr>
         <w:t xml:space="preserve">Tipo: </w:t>
       </w:r>
@@ -1143,30 +1166,28 @@
         <w:rPr>
           <w:rFonts w:ascii="Arial" w:hAnsi="Arial"/>
           <w:b/>
-          <w:color w:val="319795"/>
-          <w:sz w:val="19"/>
+          <w:color w:val="B45309"/>
+          <w:sz w:val="20"/>
         </w:rPr>
         <w:t>[No Transaccional 2 (Configuración y Analítica)]</w:t>
       </w:r>
     </w:p>
     <w:p>
       <w:pPr>
-        <w:spacing w:after="80" w:line="276" w:lineRule="auto"/>
+        <w:spacing w:after="60"/>
       </w:pPr>
       <w:r>
         <w:rPr>
           <w:rFonts w:ascii="Arial" w:hAnsi="Arial"/>
           <w:b/>
-          <w:color w:val="2D3748"/>
-          <w:sz w:val="19"/>
+          <w:color w:val="000000"/>
         </w:rPr>
         <w:t xml:space="preserve">Descripción: </w:t>
       </w:r>
       <w:r>
         <w:rPr>
           <w:rFonts w:ascii="Arial" w:hAnsi="Arial"/>
-          <w:color w:val="2D3748"/>
-          <w:sz w:val="19"/>
+          <w:color w:val="000000"/>
         </w:rPr>
         <w:t>Módulo administrativo y de soporte para la gestión de parámetros globales de negocio, tarifas base, catálogo de mineros y visualización de indicadores clave (KPIs) en el Dashboard general.</w:t>
       </w:r>
@@ -1179,8 +1200,7 @@
         <w:rPr>
           <w:rFonts w:ascii="Arial" w:hAnsi="Arial"/>
           <w:b/>
-          <w:color w:val="2D3748"/>
-          <w:sz w:val="19"/>
+          <w:color w:val="000000"/>
         </w:rPr>
         <w:t>Requerimientos Funcionales:</w:t>
       </w:r>
@@ -1188,22 +1208,22 @@
     <w:p>
       <w:pPr>
         <w:pStyle w:val="ListBullet"/>
-        <w:spacing w:after="40" w:line="264" w:lineRule="auto"/>
+        <w:spacing w:after="40" w:line="276" w:lineRule="auto"/>
       </w:pPr>
       <w:r>
         <w:rPr>
           <w:rFonts w:ascii="Arial" w:hAnsi="Arial"/>
           <w:b/>
-          <w:color w:val="1A365D"/>
-          <w:sz w:val="18"/>
+          <w:color w:val="000000"/>
+          <w:sz w:val="20"/>
         </w:rPr>
         <w:t xml:space="preserve">RF-PAR-01: </w:t>
       </w:r>
       <w:r>
         <w:rPr>
           <w:rFonts w:ascii="Arial" w:hAnsi="Arial"/>
-          <w:color w:val="2D3748"/>
-          <w:sz w:val="18"/>
+          <w:color w:val="000000"/>
+          <w:sz w:val="20"/>
         </w:rPr>
         <w:t>Consultar el precio oficial vigente del gramo de oro del día.</w:t>
       </w:r>
@@ -1211,22 +1231,22 @@
     <w:p>
       <w:pPr>
         <w:pStyle w:val="ListBullet"/>
-        <w:spacing w:after="40" w:line="264" w:lineRule="auto"/>
+        <w:spacing w:after="40" w:line="276" w:lineRule="auto"/>
       </w:pPr>
       <w:r>
         <w:rPr>
           <w:rFonts w:ascii="Arial" w:hAnsi="Arial"/>
           <w:b/>
-          <w:color w:val="1A365D"/>
-          <w:sz w:val="18"/>
+          <w:color w:val="000000"/>
+          <w:sz w:val="20"/>
         </w:rPr>
         <w:t xml:space="preserve">RF-PAR-02: </w:t>
       </w:r>
       <w:r>
         <w:rPr>
           <w:rFonts w:ascii="Arial" w:hAnsi="Arial"/>
-          <w:color w:val="2D3748"/>
-          <w:sz w:val="18"/>
+          <w:color w:val="000000"/>
+          <w:sz w:val="20"/>
         </w:rPr>
         <w:t>Permitir la actualización del precio diario del gramo de oro (restringido al rol ROLE_G1_MAYORISTA).</w:t>
       </w:r>
@@ -1234,22 +1254,22 @@
     <w:p>
       <w:pPr>
         <w:pStyle w:val="ListBullet"/>
-        <w:spacing w:after="40" w:line="264" w:lineRule="auto"/>
+        <w:spacing w:after="40" w:line="276" w:lineRule="auto"/>
       </w:pPr>
       <w:r>
         <w:rPr>
           <w:rFonts w:ascii="Arial" w:hAnsi="Arial"/>
           <w:b/>
-          <w:color w:val="1A365D"/>
-          <w:sz w:val="18"/>
+          <w:color w:val="000000"/>
+          <w:sz w:val="20"/>
         </w:rPr>
         <w:t xml:space="preserve">RF-PAR-03: </w:t>
       </w:r>
       <w:r>
         <w:rPr>
           <w:rFonts w:ascii="Arial" w:hAnsi="Arial"/>
-          <w:color w:val="2D3748"/>
-          <w:sz w:val="18"/>
+          <w:color w:val="000000"/>
+          <w:sz w:val="20"/>
         </w:rPr>
         <w:t>Administrar el catálogo maestro de mineros recurrentes (nombres, DNI, procedencia/zona minera).</w:t>
       </w:r>
@@ -1257,22 +1277,22 @@
     <w:p>
       <w:pPr>
         <w:pStyle w:val="ListBullet"/>
-        <w:spacing w:after="40" w:line="264" w:lineRule="auto"/>
+        <w:spacing w:after="40" w:line="276" w:lineRule="auto"/>
       </w:pPr>
       <w:r>
         <w:rPr>
           <w:rFonts w:ascii="Arial" w:hAnsi="Arial"/>
           <w:b/>
-          <w:color w:val="1A365D"/>
-          <w:sz w:val="18"/>
+          <w:color w:val="000000"/>
+          <w:sz w:val="20"/>
         </w:rPr>
         <w:t xml:space="preserve">RF-PAR-04: </w:t>
       </w:r>
       <w:r>
         <w:rPr>
           <w:rFonts w:ascii="Arial" w:hAnsi="Arial"/>
-          <w:color w:val="2D3748"/>
-          <w:sz w:val="18"/>
+          <w:color w:val="000000"/>
+          <w:sz w:val="20"/>
         </w:rPr>
         <w:t>Mostrar el histórico cronológico de variación de los precios del oro.</w:t>
       </w:r>
@@ -1280,36 +1300,35 @@
     <w:p>
       <w:pPr>
         <w:pStyle w:val="ListBullet"/>
-        <w:spacing w:after="40" w:line="264" w:lineRule="auto"/>
+        <w:spacing w:after="40" w:line="276" w:lineRule="auto"/>
       </w:pPr>
       <w:r>
         <w:rPr>
           <w:rFonts w:ascii="Arial" w:hAnsi="Arial"/>
           <w:b/>
-          <w:color w:val="1A365D"/>
-          <w:sz w:val="18"/>
+          <w:color w:val="000000"/>
+          <w:sz w:val="20"/>
         </w:rPr>
         <w:t xml:space="preserve">RF-PAR-05: </w:t>
       </w:r>
       <w:r>
         <w:rPr>
           <w:rFonts w:ascii="Arial" w:hAnsi="Arial"/>
-          <w:color w:val="2D3748"/>
-          <w:sz w:val="18"/>
+          <w:color w:val="000000"/>
+          <w:sz w:val="20"/>
         </w:rPr>
         <w:t>Generar y presentar el Dashboard Consolidado con métricas de gramos acopiados (Rojo vs. Verde), total desembolsado y cantidad de operaciones.</w:t>
       </w:r>
     </w:p>
     <w:p>
       <w:pPr>
-        <w:spacing w:before="60" w:after="160"/>
+        <w:spacing w:before="40" w:after="160"/>
       </w:pPr>
       <w:r>
         <w:rPr>
           <w:rFonts w:ascii="Arial" w:hAnsi="Arial"/>
           <w:b/>
-          <w:color w:val="2D3748"/>
-          <w:sz w:val="19"/>
+          <w:color w:val="000000"/>
         </w:rPr>
         <w:t xml:space="preserve">Programador Responsable: </w:t>
       </w:r>
@@ -1317,23 +1336,21 @@
         <w:rPr>
           <w:rFonts w:ascii="Arial" w:hAnsi="Arial"/>
           <w:b/>
-          <w:color w:val="2B6CB0"/>
-          <w:sz w:val="19"/>
+          <w:color w:val="003366"/>
         </w:rPr>
         <w:t>Figueroa Chambi Jhymel Nelio</w:t>
       </w:r>
     </w:p>
     <w:p>
       <w:pPr>
-        <w:pStyle w:val="Heading1"/>
-        <w:spacing w:before="320" w:after="160"/>
+        <w:spacing w:before="240" w:after="160"/>
       </w:pPr>
       <w:r>
         <w:rPr>
           <w:rFonts w:ascii="Arial" w:hAnsi="Arial"/>
           <w:b/>
-          <w:color w:val="2B6CB0"/>
-          <w:sz w:val="28"/>
+          <w:color w:val="003366"/>
+          <w:sz w:val="26"/>
         </w:rPr>
         <w:t>3. Resumen y Asignación de Responsabilidades</w:t>
       </w:r>
@@ -1342,12 +1359,13 @@
       <w:tblPr>
         <w:tblW w:type="auto" w:w="0"/>
         <w:jc w:val="center"/>
+        <w:tblLayout w:type="fixed"/>
         <w:tblLook w:firstColumn="1" w:firstRow="1" w:lastColumn="0" w:lastRow="0" w:noHBand="0" w:noVBand="1" w:val="04A0"/>
         <w:tblBorders>
-          <w:top w:val="single" w:sz="6" w:space="0" w:color="CBD5E0"/>
-          <w:bottom w:val="single" w:sz="6" w:space="0" w:color="CBD5E0"/>
-          <w:insideH w:val="single" w:sz="4" w:space="0" w:color="CBD5E0"/>
-          <w:insideV w:val="single" w:sz="4" w:space="0" w:color="CBD5E0"/>
+          <w:top w:val="single" w:sz="8" w:space="0" w:color="003366"/>
+          <w:bottom w:val="single" w:sz="8" w:space="0" w:color="003366"/>
+          <w:insideH w:val="single" w:sz="4" w:space="0" w:color="D1D5DB"/>
+          <w:insideV w:val="none"/>
           <w:left w:val="none"/>
           <w:right w:val="none"/>
         </w:tblBorders>
@@ -1362,17 +1380,18 @@
       <w:tr>
         <w:tc>
           <w:tcPr>
-            <w:tcW w:type="dxa" w:w="1872"/>
-            <w:shd w:fill="1A365D"/>
+            <w:tcW w:type="dxa" w:w="576"/>
+            <w:shd w:fill="002D62"/>
             <w:tcMar>
-              <w:top w:w="100" w:type="dxa"/>
-              <w:bottom w:w="100" w:type="dxa"/>
-              <w:left w:w="120" w:type="dxa"/>
-              <w:right w:w="120" w:type="dxa"/>
+              <w:top w:w="120" w:type="dxa"/>
+              <w:bottom w:w="120" w:type="dxa"/>
+              <w:left w:w="100" w:type="dxa"/>
+              <w:right w:w="100" w:type="dxa"/>
             </w:tcMar>
           </w:tcPr>
           <w:p>
             <w:pPr>
+              <w:spacing w:after="0"/>
               <w:jc w:val="center"/>
             </w:pPr>
             <w:r>
@@ -1380,7 +1399,7 @@
                 <w:rFonts w:ascii="Arial" w:hAnsi="Arial"/>
                 <w:b/>
                 <w:color w:val="FFFFFF"/>
-                <w:sz w:val="17"/>
+                <w:sz w:val="18"/>
               </w:rPr>
               <w:t>N°</w:t>
             </w:r>
@@ -1388,25 +1407,26 @@
         </w:tc>
         <w:tc>
           <w:tcPr>
-            <w:tcW w:type="dxa" w:w="1872"/>
-            <w:shd w:fill="1A365D"/>
+            <w:tcW w:type="dxa" w:w="2160"/>
+            <w:shd w:fill="002D62"/>
             <w:tcMar>
-              <w:top w:w="100" w:type="dxa"/>
-              <w:bottom w:w="100" w:type="dxa"/>
-              <w:left w:w="120" w:type="dxa"/>
-              <w:right w:w="120" w:type="dxa"/>
+              <w:top w:w="120" w:type="dxa"/>
+              <w:bottom w:w="120" w:type="dxa"/>
+              <w:left w:w="100" w:type="dxa"/>
+              <w:right w:w="100" w:type="dxa"/>
             </w:tcMar>
           </w:tcPr>
           <w:p>
             <w:pPr>
-              <w:jc w:val="center"/>
+              <w:spacing w:after="0"/>
+              <w:jc w:val="left"/>
             </w:pPr>
             <w:r>
               <w:rPr>
                 <w:rFonts w:ascii="Arial" w:hAnsi="Arial"/>
                 <w:b/>
                 <w:color w:val="FFFFFF"/>
-                <w:sz w:val="17"/>
+                <w:sz w:val="18"/>
               </w:rPr>
               <w:t>Nombre del Módulo</w:t>
             </w:r>
@@ -1414,25 +1434,26 @@
         </w:tc>
         <w:tc>
           <w:tcPr>
-            <w:tcW w:type="dxa" w:w="1872"/>
-            <w:shd w:fill="1A365D"/>
+            <w:tcW w:type="dxa" w:w="1728"/>
+            <w:shd w:fill="002D62"/>
             <w:tcMar>
-              <w:top w:w="100" w:type="dxa"/>
-              <w:bottom w:w="100" w:type="dxa"/>
-              <w:left w:w="120" w:type="dxa"/>
-              <w:right w:w="120" w:type="dxa"/>
+              <w:top w:w="120" w:type="dxa"/>
+              <w:bottom w:w="120" w:type="dxa"/>
+              <w:left w:w="100" w:type="dxa"/>
+              <w:right w:w="100" w:type="dxa"/>
             </w:tcMar>
           </w:tcPr>
           <w:p>
             <w:pPr>
-              <w:jc w:val="center"/>
+              <w:spacing w:after="0"/>
+              <w:jc w:val="left"/>
             </w:pPr>
             <w:r>
               <w:rPr>
                 <w:rFonts w:ascii="Arial" w:hAnsi="Arial"/>
                 <w:b/>
                 <w:color w:val="FFFFFF"/>
-                <w:sz w:val="17"/>
+                <w:sz w:val="18"/>
               </w:rPr>
               <w:t>Tipo Arquitectónico</w:t>
             </w:r>
@@ -1440,25 +1461,26 @@
         </w:tc>
         <w:tc>
           <w:tcPr>
-            <w:tcW w:type="dxa" w:w="1872"/>
-            <w:shd w:fill="1A365D"/>
+            <w:tcW w:type="dxa" w:w="2592"/>
+            <w:shd w:fill="002D62"/>
             <w:tcMar>
-              <w:top w:w="100" w:type="dxa"/>
-              <w:bottom w:w="100" w:type="dxa"/>
-              <w:left w:w="120" w:type="dxa"/>
-              <w:right w:w="120" w:type="dxa"/>
+              <w:top w:w="120" w:type="dxa"/>
+              <w:bottom w:w="120" w:type="dxa"/>
+              <w:left w:w="100" w:type="dxa"/>
+              <w:right w:w="100" w:type="dxa"/>
             </w:tcMar>
           </w:tcPr>
           <w:p>
             <w:pPr>
-              <w:jc w:val="center"/>
+              <w:spacing w:after="0"/>
+              <w:jc w:val="left"/>
             </w:pPr>
             <w:r>
               <w:rPr>
                 <w:rFonts w:ascii="Arial" w:hAnsi="Arial"/>
                 <w:b/>
                 <w:color w:val="FFFFFF"/>
-                <w:sz w:val="17"/>
+                <w:sz w:val="18"/>
               </w:rPr>
               <w:t>Programador Responsable</w:t>
             </w:r>
@@ -1466,25 +1488,26 @@
         </w:tc>
         <w:tc>
           <w:tcPr>
-            <w:tcW w:type="dxa" w:w="1872"/>
-            <w:shd w:fill="1A365D"/>
+            <w:tcW w:type="dxa" w:w="2304"/>
+            <w:shd w:fill="002D62"/>
             <w:tcMar>
-              <w:top w:w="100" w:type="dxa"/>
-              <w:bottom w:w="100" w:type="dxa"/>
-              <w:left w:w="120" w:type="dxa"/>
-              <w:right w:w="120" w:type="dxa"/>
+              <w:top w:w="120" w:type="dxa"/>
+              <w:bottom w:w="120" w:type="dxa"/>
+              <w:left w:w="100" w:type="dxa"/>
+              <w:right w:w="100" w:type="dxa"/>
             </w:tcMar>
           </w:tcPr>
           <w:p>
             <w:pPr>
-              <w:jc w:val="center"/>
+              <w:spacing w:after="0"/>
+              <w:jc w:val="left"/>
             </w:pPr>
             <w:r>
               <w:rPr>
                 <w:rFonts w:ascii="Arial" w:hAnsi="Arial"/>
                 <w:b/>
                 <w:color w:val="FFFFFF"/>
-                <w:sz w:val="17"/>
+                <w:sz w:val="18"/>
               </w:rPr>
               <w:t>Aporte en Línea Curricular</w:t>
             </w:r>
@@ -1494,24 +1517,25 @@
       <w:tr>
         <w:tc>
           <w:tcPr>
-            <w:tcW w:type="dxa" w:w="1872"/>
-            <w:shd w:fill="F7FAFC"/>
+            <w:tcW w:type="dxa" w:w="576"/>
+            <w:shd w:fill="FFFFFF"/>
             <w:tcMar>
-              <w:top w:w="80" w:type="dxa"/>
-              <w:bottom w:w="80" w:type="dxa"/>
+              <w:top w:w="90" w:type="dxa"/>
+              <w:bottom w:w="90" w:type="dxa"/>
               <w:left w:w="100" w:type="dxa"/>
               <w:right w:w="100" w:type="dxa"/>
             </w:tcMar>
           </w:tcPr>
           <w:p>
             <w:pPr>
+              <w:spacing w:after="0"/>
               <w:jc w:val="center"/>
             </w:pPr>
             <w:r>
               <w:rPr>
                 <w:rFonts w:ascii="Arial" w:hAnsi="Arial"/>
                 <w:b/>
-                <w:color w:val="2D3748"/>
+                <w:color w:val="000000"/>
                 <w:sz w:val="17"/>
               </w:rPr>
               <w:t>1</w:t>
@@ -1520,21 +1544,25 @@
         </w:tc>
         <w:tc>
           <w:tcPr>
-            <w:tcW w:type="dxa" w:w="1872"/>
-            <w:shd w:fill="F7FAFC"/>
+            <w:tcW w:type="dxa" w:w="2160"/>
+            <w:shd w:fill="FFFFFF"/>
             <w:tcMar>
-              <w:top w:w="80" w:type="dxa"/>
-              <w:bottom w:w="80" w:type="dxa"/>
+              <w:top w:w="90" w:type="dxa"/>
+              <w:bottom w:w="90" w:type="dxa"/>
               <w:left w:w="100" w:type="dxa"/>
               <w:right w:w="100" w:type="dxa"/>
             </w:tcMar>
           </w:tcPr>
           <w:p>
+            <w:pPr>
+              <w:spacing w:after="0"/>
+              <w:jc w:val="left"/>
+            </w:pPr>
             <w:r>
               <w:rPr>
                 <w:rFonts w:ascii="Arial" w:hAnsi="Arial"/>
                 <w:b/>
-                <w:color w:val="2D3748"/>
+                <w:color w:val="000000"/>
                 <w:sz w:val="17"/>
               </w:rPr>
               <w:t>Seguridad (seguridad)</w:t>
@@ -1543,20 +1571,24 @@
         </w:tc>
         <w:tc>
           <w:tcPr>
-            <w:tcW w:type="dxa" w:w="1872"/>
-            <w:shd w:fill="F7FAFC"/>
+            <w:tcW w:type="dxa" w:w="1728"/>
+            <w:shd w:fill="FFFFFF"/>
             <w:tcMar>
-              <w:top w:w="80" w:type="dxa"/>
-              <w:bottom w:w="80" w:type="dxa"/>
+              <w:top w:w="90" w:type="dxa"/>
+              <w:bottom w:w="90" w:type="dxa"/>
               <w:left w:w="100" w:type="dxa"/>
               <w:right w:w="100" w:type="dxa"/>
             </w:tcMar>
           </w:tcPr>
           <w:p>
+            <w:pPr>
+              <w:spacing w:after="0"/>
+              <w:jc w:val="left"/>
+            </w:pPr>
             <w:r>
               <w:rPr>
                 <w:rFonts w:ascii="Arial" w:hAnsi="Arial"/>
-                <w:color w:val="2D3748"/>
+                <w:color w:val="000000"/>
                 <w:sz w:val="17"/>
               </w:rPr>
               <w:t>Transversal</w:t>
@@ -1565,20 +1597,24 @@
         </w:tc>
         <w:tc>
           <w:tcPr>
-            <w:tcW w:type="dxa" w:w="1872"/>
-            <w:shd w:fill="F7FAFC"/>
+            <w:tcW w:type="dxa" w:w="2592"/>
+            <w:shd w:fill="FFFFFF"/>
             <w:tcMar>
-              <w:top w:w="80" w:type="dxa"/>
-              <w:bottom w:w="80" w:type="dxa"/>
+              <w:top w:w="90" w:type="dxa"/>
+              <w:bottom w:w="90" w:type="dxa"/>
               <w:left w:w="100" w:type="dxa"/>
               <w:right w:w="100" w:type="dxa"/>
             </w:tcMar>
           </w:tcPr>
           <w:p>
+            <w:pPr>
+              <w:spacing w:after="0"/>
+              <w:jc w:val="left"/>
+            </w:pPr>
             <w:r>
               <w:rPr>
                 <w:rFonts w:ascii="Arial" w:hAnsi="Arial"/>
-                <w:color w:val="2D3748"/>
+                <w:color w:val="000000"/>
                 <w:sz w:val="17"/>
               </w:rPr>
               <w:t>Faijo Calisaya Helio Paul &amp;</w:t>
@@ -1589,20 +1625,24 @@
         </w:tc>
         <w:tc>
           <w:tcPr>
-            <w:tcW w:type="dxa" w:w="1872"/>
-            <w:shd w:fill="F7FAFC"/>
+            <w:tcW w:type="dxa" w:w="2304"/>
+            <w:shd w:fill="FFFFFF"/>
             <w:tcMar>
-              <w:top w:w="80" w:type="dxa"/>
-              <w:bottom w:w="80" w:type="dxa"/>
+              <w:top w:w="90" w:type="dxa"/>
+              <w:bottom w:w="90" w:type="dxa"/>
               <w:left w:w="100" w:type="dxa"/>
               <w:right w:w="100" w:type="dxa"/>
             </w:tcMar>
           </w:tcPr>
           <w:p>
+            <w:pPr>
+              <w:spacing w:after="0"/>
+              <w:jc w:val="left"/>
+            </w:pPr>
             <w:r>
               <w:rPr>
                 <w:rFonts w:ascii="Arial" w:hAnsi="Arial"/>
-                <w:color w:val="2D3748"/>
+                <w:color w:val="000000"/>
                 <w:sz w:val="17"/>
               </w:rPr>
               <w:t>JWT, BCrypt, Security Filters, UserDetails</w:t>
@@ -1613,24 +1653,25 @@
       <w:tr>
         <w:tc>
           <w:tcPr>
-            <w:tcW w:type="dxa" w:w="1872"/>
-            <w:shd w:fill="FFFFFF"/>
+            <w:tcW w:type="dxa" w:w="576"/>
+            <w:shd w:fill="F0F4F8"/>
             <w:tcMar>
-              <w:top w:w="80" w:type="dxa"/>
-              <w:bottom w:w="80" w:type="dxa"/>
+              <w:top w:w="90" w:type="dxa"/>
+              <w:bottom w:w="90" w:type="dxa"/>
               <w:left w:w="100" w:type="dxa"/>
               <w:right w:w="100" w:type="dxa"/>
             </w:tcMar>
           </w:tcPr>
           <w:p>
             <w:pPr>
+              <w:spacing w:after="0"/>
               <w:jc w:val="center"/>
             </w:pPr>
             <w:r>
               <w:rPr>
                 <w:rFonts w:ascii="Arial" w:hAnsi="Arial"/>
                 <w:b/>
-                <w:color w:val="2D3748"/>
+                <w:color w:val="000000"/>
                 <w:sz w:val="17"/>
               </w:rPr>
               <w:t>2</w:t>
@@ -1639,21 +1680,25 @@
         </w:tc>
         <w:tc>
           <w:tcPr>
-            <w:tcW w:type="dxa" w:w="1872"/>
-            <w:shd w:fill="FFFFFF"/>
+            <w:tcW w:type="dxa" w:w="2160"/>
+            <w:shd w:fill="F0F4F8"/>
             <w:tcMar>
-              <w:top w:w="80" w:type="dxa"/>
-              <w:bottom w:w="80" w:type="dxa"/>
+              <w:top w:w="90" w:type="dxa"/>
+              <w:bottom w:w="90" w:type="dxa"/>
               <w:left w:w="100" w:type="dxa"/>
               <w:right w:w="100" w:type="dxa"/>
             </w:tcMar>
           </w:tcPr>
           <w:p>
+            <w:pPr>
+              <w:spacing w:after="0"/>
+              <w:jc w:val="left"/>
+            </w:pPr>
             <w:r>
               <w:rPr>
                 <w:rFonts w:ascii="Arial" w:hAnsi="Arial"/>
                 <w:b/>
-                <w:color w:val="2D3748"/>
+                <w:color w:val="000000"/>
                 <w:sz w:val="17"/>
               </w:rPr>
               <w:t>Acopiador (acopiador)</w:t>
@@ -1662,20 +1707,24 @@
         </w:tc>
         <w:tc>
           <w:tcPr>
-            <w:tcW w:type="dxa" w:w="1872"/>
-            <w:shd w:fill="FFFFFF"/>
+            <w:tcW w:type="dxa" w:w="1728"/>
+            <w:shd w:fill="F0F4F8"/>
             <w:tcMar>
-              <w:top w:w="80" w:type="dxa"/>
-              <w:bottom w:w="80" w:type="dxa"/>
+              <w:top w:w="90" w:type="dxa"/>
+              <w:bottom w:w="90" w:type="dxa"/>
               <w:left w:w="100" w:type="dxa"/>
               <w:right w:w="100" w:type="dxa"/>
             </w:tcMar>
           </w:tcPr>
           <w:p>
+            <w:pPr>
+              <w:spacing w:after="0"/>
+              <w:jc w:val="left"/>
+            </w:pPr>
             <w:r>
               <w:rPr>
                 <w:rFonts w:ascii="Arial" w:hAnsi="Arial"/>
-                <w:color w:val="2D3748"/>
+                <w:color w:val="000000"/>
                 <w:sz w:val="17"/>
               </w:rPr>
               <w:t>Transaccional 1</w:t>
@@ -1684,20 +1733,24 @@
         </w:tc>
         <w:tc>
           <w:tcPr>
-            <w:tcW w:type="dxa" w:w="1872"/>
-            <w:shd w:fill="FFFFFF"/>
+            <w:tcW w:type="dxa" w:w="2592"/>
+            <w:shd w:fill="F0F4F8"/>
             <w:tcMar>
-              <w:top w:w="80" w:type="dxa"/>
-              <w:bottom w:w="80" w:type="dxa"/>
+              <w:top w:w="90" w:type="dxa"/>
+              <w:bottom w:w="90" w:type="dxa"/>
               <w:left w:w="100" w:type="dxa"/>
               <w:right w:w="100" w:type="dxa"/>
             </w:tcMar>
           </w:tcPr>
           <w:p>
+            <w:pPr>
+              <w:spacing w:after="0"/>
+              <w:jc w:val="left"/>
+            </w:pPr>
             <w:r>
               <w:rPr>
                 <w:rFonts w:ascii="Arial" w:hAnsi="Arial"/>
-                <w:color w:val="2D3748"/>
+                <w:color w:val="000000"/>
                 <w:sz w:val="17"/>
               </w:rPr>
               <w:t>Faijo Calisaya Helio Paul</w:t>
@@ -1706,20 +1759,24 @@
         </w:tc>
         <w:tc>
           <w:tcPr>
-            <w:tcW w:type="dxa" w:w="1872"/>
-            <w:shd w:fill="FFFFFF"/>
+            <w:tcW w:type="dxa" w:w="2304"/>
+            <w:shd w:fill="F0F4F8"/>
             <w:tcMar>
-              <w:top w:w="80" w:type="dxa"/>
-              <w:bottom w:w="80" w:type="dxa"/>
+              <w:top w:w="90" w:type="dxa"/>
+              <w:bottom w:w="90" w:type="dxa"/>
               <w:left w:w="100" w:type="dxa"/>
               <w:right w:w="100" w:type="dxa"/>
             </w:tcMar>
           </w:tcPr>
           <w:p>
+            <w:pPr>
+              <w:spacing w:after="0"/>
+              <w:jc w:val="left"/>
+            </w:pPr>
             <w:r>
               <w:rPr>
                 <w:rFonts w:ascii="Arial" w:hAnsi="Arial"/>
-                <w:color w:val="2D3748"/>
+                <w:color w:val="000000"/>
                 <w:sz w:val="17"/>
               </w:rPr>
               <w:t>Compras G2, Fundición Real, Oro Rojo/Verde</w:t>
@@ -1730,24 +1787,25 @@
       <w:tr>
         <w:tc>
           <w:tcPr>
-            <w:tcW w:type="dxa" w:w="1872"/>
-            <w:shd w:fill="F7FAFC"/>
+            <w:tcW w:type="dxa" w:w="576"/>
+            <w:shd w:fill="FFFFFF"/>
             <w:tcMar>
-              <w:top w:w="80" w:type="dxa"/>
-              <w:bottom w:w="80" w:type="dxa"/>
+              <w:top w:w="90" w:type="dxa"/>
+              <w:bottom w:w="90" w:type="dxa"/>
               <w:left w:w="100" w:type="dxa"/>
               <w:right w:w="100" w:type="dxa"/>
             </w:tcMar>
           </w:tcPr>
           <w:p>
             <w:pPr>
+              <w:spacing w:after="0"/>
               <w:jc w:val="center"/>
             </w:pPr>
             <w:r>
               <w:rPr>
                 <w:rFonts w:ascii="Arial" w:hAnsi="Arial"/>
                 <w:b/>
-                <w:color w:val="2D3748"/>
+                <w:color w:val="000000"/>
                 <w:sz w:val="17"/>
               </w:rPr>
               <w:t>3</w:t>
@@ -1756,21 +1814,25 @@
         </w:tc>
         <w:tc>
           <w:tcPr>
-            <w:tcW w:type="dxa" w:w="1872"/>
-            <w:shd w:fill="F7FAFC"/>
+            <w:tcW w:type="dxa" w:w="2160"/>
+            <w:shd w:fill="FFFFFF"/>
             <w:tcMar>
-              <w:top w:w="80" w:type="dxa"/>
-              <w:bottom w:w="80" w:type="dxa"/>
+              <w:top w:w="90" w:type="dxa"/>
+              <w:bottom w:w="90" w:type="dxa"/>
               <w:left w:w="100" w:type="dxa"/>
               <w:right w:w="100" w:type="dxa"/>
             </w:tcMar>
           </w:tcPr>
           <w:p>
+            <w:pPr>
+              <w:spacing w:after="0"/>
+              <w:jc w:val="left"/>
+            </w:pPr>
             <w:r>
               <w:rPr>
                 <w:rFonts w:ascii="Arial" w:hAnsi="Arial"/>
                 <w:b/>
-                <w:color w:val="2D3748"/>
+                <w:color w:val="000000"/>
                 <w:sz w:val="17"/>
               </w:rPr>
               <w:t>Mayorista (mayorista)</w:t>
@@ -1779,20 +1841,24 @@
         </w:tc>
         <w:tc>
           <w:tcPr>
-            <w:tcW w:type="dxa" w:w="1872"/>
-            <w:shd w:fill="F7FAFC"/>
+            <w:tcW w:type="dxa" w:w="1728"/>
+            <w:shd w:fill="FFFFFF"/>
             <w:tcMar>
-              <w:top w:w="80" w:type="dxa"/>
-              <w:bottom w:w="80" w:type="dxa"/>
+              <w:top w:w="90" w:type="dxa"/>
+              <w:bottom w:w="90" w:type="dxa"/>
               <w:left w:w="100" w:type="dxa"/>
               <w:right w:w="100" w:type="dxa"/>
             </w:tcMar>
           </w:tcPr>
           <w:p>
+            <w:pPr>
+              <w:spacing w:after="0"/>
+              <w:jc w:val="left"/>
+            </w:pPr>
             <w:r>
               <w:rPr>
                 <w:rFonts w:ascii="Arial" w:hAnsi="Arial"/>
-                <w:color w:val="2D3748"/>
+                <w:color w:val="000000"/>
                 <w:sz w:val="17"/>
               </w:rPr>
               <w:t>Transaccional 2</w:t>
@@ -1801,20 +1867,24 @@
         </w:tc>
         <w:tc>
           <w:tcPr>
-            <w:tcW w:type="dxa" w:w="1872"/>
-            <w:shd w:fill="F7FAFC"/>
+            <w:tcW w:type="dxa" w:w="2592"/>
+            <w:shd w:fill="FFFFFF"/>
             <w:tcMar>
-              <w:top w:w="80" w:type="dxa"/>
-              <w:bottom w:w="80" w:type="dxa"/>
+              <w:top w:w="90" w:type="dxa"/>
+              <w:bottom w:w="90" w:type="dxa"/>
               <w:left w:w="100" w:type="dxa"/>
               <w:right w:w="100" w:type="dxa"/>
             </w:tcMar>
           </w:tcPr>
           <w:p>
+            <w:pPr>
+              <w:spacing w:after="0"/>
+              <w:jc w:val="left"/>
+            </w:pPr>
             <w:r>
               <w:rPr>
                 <w:rFonts w:ascii="Arial" w:hAnsi="Arial"/>
-                <w:color w:val="2D3748"/>
+                <w:color w:val="000000"/>
                 <w:sz w:val="17"/>
               </w:rPr>
               <w:t>Figueroa Chambi Jhymel Nelio</w:t>
@@ -1823,20 +1893,24 @@
         </w:tc>
         <w:tc>
           <w:tcPr>
-            <w:tcW w:type="dxa" w:w="1872"/>
-            <w:shd w:fill="F7FAFC"/>
+            <w:tcW w:type="dxa" w:w="2304"/>
+            <w:shd w:fill="FFFFFF"/>
             <w:tcMar>
-              <w:top w:w="80" w:type="dxa"/>
-              <w:bottom w:w="80" w:type="dxa"/>
+              <w:top w:w="90" w:type="dxa"/>
+              <w:bottom w:w="90" w:type="dxa"/>
               <w:left w:w="100" w:type="dxa"/>
               <w:right w:w="100" w:type="dxa"/>
             </w:tcMar>
           </w:tcPr>
           <w:p>
+            <w:pPr>
+              <w:spacing w:after="0"/>
+              <w:jc w:val="left"/>
+            </w:pPr>
             <w:r>
               <w:rPr>
                 <w:rFonts w:ascii="Arial" w:hAnsi="Arial"/>
-                <w:color w:val="2D3748"/>
+                <w:color w:val="000000"/>
                 <w:sz w:val="17"/>
               </w:rPr>
               <w:t>Cierres G1, Onza Troy USD, Tipo de Cambio</w:t>
@@ -1847,24 +1921,25 @@
       <w:tr>
         <w:tc>
           <w:tcPr>
-            <w:tcW w:type="dxa" w:w="1872"/>
-            <w:shd w:fill="FFFFFF"/>
+            <w:tcW w:type="dxa" w:w="576"/>
+            <w:shd w:fill="F0F4F8"/>
             <w:tcMar>
-              <w:top w:w="80" w:type="dxa"/>
-              <w:bottom w:w="80" w:type="dxa"/>
+              <w:top w:w="90" w:type="dxa"/>
+              <w:bottom w:w="90" w:type="dxa"/>
               <w:left w:w="100" w:type="dxa"/>
               <w:right w:w="100" w:type="dxa"/>
             </w:tcMar>
           </w:tcPr>
           <w:p>
             <w:pPr>
+              <w:spacing w:after="0"/>
               <w:jc w:val="center"/>
             </w:pPr>
             <w:r>
               <w:rPr>
                 <w:rFonts w:ascii="Arial" w:hAnsi="Arial"/>
                 <w:b/>
-                <w:color w:val="2D3748"/>
+                <w:color w:val="000000"/>
                 <w:sz w:val="17"/>
               </w:rPr>
               <w:t>4</w:t>
@@ -1873,21 +1948,25 @@
         </w:tc>
         <w:tc>
           <w:tcPr>
-            <w:tcW w:type="dxa" w:w="1872"/>
-            <w:shd w:fill="FFFFFF"/>
+            <w:tcW w:type="dxa" w:w="2160"/>
+            <w:shd w:fill="F0F4F8"/>
             <w:tcMar>
-              <w:top w:w="80" w:type="dxa"/>
-              <w:bottom w:w="80" w:type="dxa"/>
+              <w:top w:w="90" w:type="dxa"/>
+              <w:bottom w:w="90" w:type="dxa"/>
               <w:left w:w="100" w:type="dxa"/>
               <w:right w:w="100" w:type="dxa"/>
             </w:tcMar>
           </w:tcPr>
           <w:p>
+            <w:pPr>
+              <w:spacing w:after="0"/>
+              <w:jc w:val="left"/>
+            </w:pPr>
             <w:r>
               <w:rPr>
                 <w:rFonts w:ascii="Arial" w:hAnsi="Arial"/>
                 <w:b/>
-                <w:color w:val="2D3748"/>
+                <w:color w:val="000000"/>
                 <w:sz w:val="17"/>
               </w:rPr>
               <w:t>Cotizador (cotizador)</w:t>
@@ -1896,20 +1975,24 @@
         </w:tc>
         <w:tc>
           <w:tcPr>
-            <w:tcW w:type="dxa" w:w="1872"/>
-            <w:shd w:fill="FFFFFF"/>
+            <w:tcW w:type="dxa" w:w="1728"/>
+            <w:shd w:fill="F0F4F8"/>
             <w:tcMar>
-              <w:top w:w="80" w:type="dxa"/>
-              <w:bottom w:w="80" w:type="dxa"/>
+              <w:top w:w="90" w:type="dxa"/>
+              <w:bottom w:w="90" w:type="dxa"/>
               <w:left w:w="100" w:type="dxa"/>
               <w:right w:w="100" w:type="dxa"/>
             </w:tcMar>
           </w:tcPr>
           <w:p>
+            <w:pPr>
+              <w:spacing w:after="0"/>
+              <w:jc w:val="left"/>
+            </w:pPr>
             <w:r>
               <w:rPr>
                 <w:rFonts w:ascii="Arial" w:hAnsi="Arial"/>
-                <w:color w:val="2D3748"/>
+                <w:color w:val="000000"/>
                 <w:sz w:val="17"/>
               </w:rPr>
               <w:t>No Transaccional 1</w:t>
@@ -1918,20 +2001,24 @@
         </w:tc>
         <w:tc>
           <w:tcPr>
-            <w:tcW w:type="dxa" w:w="1872"/>
-            <w:shd w:fill="FFFFFF"/>
+            <w:tcW w:type="dxa" w:w="2592"/>
+            <w:shd w:fill="F0F4F8"/>
             <w:tcMar>
-              <w:top w:w="80" w:type="dxa"/>
-              <w:bottom w:w="80" w:type="dxa"/>
+              <w:top w:w="90" w:type="dxa"/>
+              <w:bottom w:w="90" w:type="dxa"/>
               <w:left w:w="100" w:type="dxa"/>
               <w:right w:w="100" w:type="dxa"/>
             </w:tcMar>
           </w:tcPr>
           <w:p>
+            <w:pPr>
+              <w:spacing w:after="0"/>
+              <w:jc w:val="left"/>
+            </w:pPr>
             <w:r>
               <w:rPr>
                 <w:rFonts w:ascii="Arial" w:hAnsi="Arial"/>
-                <w:color w:val="2D3748"/>
+                <w:color w:val="000000"/>
                 <w:sz w:val="17"/>
               </w:rPr>
               <w:t>Faijo Calisaya Helio Paul</w:t>
@@ -1940,20 +2027,24 @@
         </w:tc>
         <w:tc>
           <w:tcPr>
-            <w:tcW w:type="dxa" w:w="1872"/>
-            <w:shd w:fill="FFFFFF"/>
+            <w:tcW w:type="dxa" w:w="2304"/>
+            <w:shd w:fill="F0F4F8"/>
             <w:tcMar>
-              <w:top w:w="80" w:type="dxa"/>
-              <w:bottom w:w="80" w:type="dxa"/>
+              <w:top w:w="90" w:type="dxa"/>
+              <w:bottom w:w="90" w:type="dxa"/>
               <w:left w:w="100" w:type="dxa"/>
               <w:right w:w="100" w:type="dxa"/>
             </w:tcMar>
           </w:tcPr>
           <w:p>
+            <w:pPr>
+              <w:spacing w:after="0"/>
+              <w:jc w:val="left"/>
+            </w:pPr>
             <w:r>
               <w:rPr>
                 <w:rFonts w:ascii="Arial" w:hAnsi="Arial"/>
-                <w:color w:val="2D3748"/>
+                <w:color w:val="000000"/>
                 <w:sz w:val="17"/>
               </w:rPr>
               <w:t>Simulador Minero, Merma, Cálculo en Memoria</w:t>
@@ -1964,24 +2055,25 @@
       <w:tr>
         <w:tc>
           <w:tcPr>
-            <w:tcW w:type="dxa" w:w="1872"/>
-            <w:shd w:fill="F7FAFC"/>
+            <w:tcW w:type="dxa" w:w="576"/>
+            <w:shd w:fill="FFFFFF"/>
             <w:tcMar>
-              <w:top w:w="80" w:type="dxa"/>
-              <w:bottom w:w="80" w:type="dxa"/>
+              <w:top w:w="90" w:type="dxa"/>
+              <w:bottom w:w="90" w:type="dxa"/>
               <w:left w:w="100" w:type="dxa"/>
               <w:right w:w="100" w:type="dxa"/>
             </w:tcMar>
           </w:tcPr>
           <w:p>
             <w:pPr>
+              <w:spacing w:after="0"/>
               <w:jc w:val="center"/>
             </w:pPr>
             <w:r>
               <w:rPr>
                 <w:rFonts w:ascii="Arial" w:hAnsi="Arial"/>
                 <w:b/>
-                <w:color w:val="2D3748"/>
+                <w:color w:val="000000"/>
                 <w:sz w:val="17"/>
               </w:rPr>
               <w:t>5</w:t>
@@ -1990,21 +2082,25 @@
         </w:tc>
         <w:tc>
           <w:tcPr>
-            <w:tcW w:type="dxa" w:w="1872"/>
-            <w:shd w:fill="F7FAFC"/>
+            <w:tcW w:type="dxa" w:w="2160"/>
+            <w:shd w:fill="FFFFFF"/>
             <w:tcMar>
-              <w:top w:w="80" w:type="dxa"/>
-              <w:bottom w:w="80" w:type="dxa"/>
+              <w:top w:w="90" w:type="dxa"/>
+              <w:bottom w:w="90" w:type="dxa"/>
               <w:left w:w="100" w:type="dxa"/>
               <w:right w:w="100" w:type="dxa"/>
             </w:tcMar>
           </w:tcPr>
           <w:p>
+            <w:pPr>
+              <w:spacing w:after="0"/>
+              <w:jc w:val="left"/>
+            </w:pPr>
             <w:r>
               <w:rPr>
                 <w:rFonts w:ascii="Arial" w:hAnsi="Arial"/>
                 <w:b/>
-                <w:color w:val="2D3748"/>
+                <w:color w:val="000000"/>
                 <w:sz w:val="17"/>
               </w:rPr>
               <w:t>Parámetros (parametros)</w:t>
@@ -2013,20 +2109,24 @@
         </w:tc>
         <w:tc>
           <w:tcPr>
-            <w:tcW w:type="dxa" w:w="1872"/>
-            <w:shd w:fill="F7FAFC"/>
+            <w:tcW w:type="dxa" w:w="1728"/>
+            <w:shd w:fill="FFFFFF"/>
             <w:tcMar>
-              <w:top w:w="80" w:type="dxa"/>
-              <w:bottom w:w="80" w:type="dxa"/>
+              <w:top w:w="90" w:type="dxa"/>
+              <w:bottom w:w="90" w:type="dxa"/>
               <w:left w:w="100" w:type="dxa"/>
               <w:right w:w="100" w:type="dxa"/>
             </w:tcMar>
           </w:tcPr>
           <w:p>
+            <w:pPr>
+              <w:spacing w:after="0"/>
+              <w:jc w:val="left"/>
+            </w:pPr>
             <w:r>
               <w:rPr>
                 <w:rFonts w:ascii="Arial" w:hAnsi="Arial"/>
-                <w:color w:val="2D3748"/>
+                <w:color w:val="000000"/>
                 <w:sz w:val="17"/>
               </w:rPr>
               <w:t>No Transaccional 2</w:t>
@@ -2035,20 +2135,24 @@
         </w:tc>
         <w:tc>
           <w:tcPr>
-            <w:tcW w:type="dxa" w:w="1872"/>
-            <w:shd w:fill="F7FAFC"/>
+            <w:tcW w:type="dxa" w:w="2592"/>
+            <w:shd w:fill="FFFFFF"/>
             <w:tcMar>
-              <w:top w:w="80" w:type="dxa"/>
-              <w:bottom w:w="80" w:type="dxa"/>
+              <w:top w:w="90" w:type="dxa"/>
+              <w:bottom w:w="90" w:type="dxa"/>
               <w:left w:w="100" w:type="dxa"/>
               <w:right w:w="100" w:type="dxa"/>
             </w:tcMar>
           </w:tcPr>
           <w:p>
+            <w:pPr>
+              <w:spacing w:after="0"/>
+              <w:jc w:val="left"/>
+            </w:pPr>
             <w:r>
               <w:rPr>
                 <w:rFonts w:ascii="Arial" w:hAnsi="Arial"/>
-                <w:color w:val="2D3748"/>
+                <w:color w:val="000000"/>
                 <w:sz w:val="17"/>
               </w:rPr>
               <w:t>Figueroa Chambi Jhymel Nelio</w:t>
@@ -2057,20 +2161,24 @@
         </w:tc>
         <w:tc>
           <w:tcPr>
-            <w:tcW w:type="dxa" w:w="1872"/>
-            <w:shd w:fill="F7FAFC"/>
+            <w:tcW w:type="dxa" w:w="2304"/>
+            <w:shd w:fill="FFFFFF"/>
             <w:tcMar>
-              <w:top w:w="80" w:type="dxa"/>
-              <w:bottom w:w="80" w:type="dxa"/>
+              <w:top w:w="90" w:type="dxa"/>
+              <w:bottom w:w="90" w:type="dxa"/>
               <w:left w:w="100" w:type="dxa"/>
               <w:right w:w="100" w:type="dxa"/>
             </w:tcMar>
           </w:tcPr>
           <w:p>
+            <w:pPr>
+              <w:spacing w:after="0"/>
+              <w:jc w:val="left"/>
+            </w:pPr>
             <w:r>
               <w:rPr>
                 <w:rFonts w:ascii="Arial" w:hAnsi="Arial"/>
-                <w:color w:val="2D3748"/>
+                <w:color w:val="000000"/>
                 <w:sz w:val="17"/>
               </w:rPr>
               <w:t>Precios Diarios, Mineros, Dashboard KPIs</w:t>
@@ -2092,10 +2200,10 @@
         <w:rPr>
           <w:rFonts w:ascii="Arial" w:hAnsi="Arial"/>
           <w:i/>
-          <w:color w:val="718096"/>
-          <w:sz w:val="17"/>
+          <w:color w:val="64748B"/>
+          <w:sz w:val="18"/>
         </w:rPr>
-        <w:t>Proyecto Integrador Ciclo IV — BomERP Acopio de Oro © 2026 UPeU Campus Juliaca</w:t>
+        <w:t>Proyecto Integrador Ciclo IV – SITRA-ORO Acopio de Oro – 2026 UPeU Campus Juliaca</w:t>
       </w:r>
     </w:p>
     <w:sectPr>
@@ -2471,6 +2579,14 @@
     <w:name w:val="Normal"/>
     <w:qFormat/>
     <w:rsid w:val="00FC693F"/>
+    <w:pPr>
+      <w:spacing w:line="288" w:lineRule="auto" w:after="80"/>
+    </w:pPr>
+    <w:rPr>
+      <w:rFonts w:ascii="Arial" w:hAnsi="Arial"/>
+      <w:color w:val="000000"/>
+      <w:sz w:val="21"/>
+    </w:rPr>
   </w:style>
   <w:style w:type="paragraph" w:styleId="Header">
     <w:name w:val="header"/>

</xml_diff>